<commit_message>
report up to end of UI, added titles to spider charts
</commit_message>
<xml_diff>
--- a/Appendix.docx
+++ b/Appendix.docx
@@ -936,6 +936,7 @@
         <w:rPr>
           <w:b/>
           <w:bCs/>
+          <w:noProof/>
           <w:sz w:val="24"/>
           <w:szCs w:val="24"/>
         </w:rPr>
@@ -987,6 +988,7 @@
         <w:rPr>
           <w:b/>
           <w:bCs/>
+          <w:noProof/>
         </w:rPr>
         <w:lastRenderedPageBreak/>
         <w:drawing>
@@ -1037,6 +1039,7 @@
         <w:rPr>
           <w:b/>
           <w:bCs/>
+          <w:noProof/>
         </w:rPr>
         <w:drawing>
           <wp:inline distT="0" distB="0" distL="0" distR="0" wp14:anchorId="2F33146C" wp14:editId="6A6020CE">
@@ -1086,6 +1089,7 @@
         <w:rPr>
           <w:b/>
           <w:bCs/>
+          <w:noProof/>
         </w:rPr>
         <w:drawing>
           <wp:inline distT="0" distB="0" distL="0" distR="0" wp14:anchorId="6591257B" wp14:editId="0C57DBD8">
@@ -1135,6 +1139,7 @@
         <w:rPr>
           <w:b/>
           <w:bCs/>
+          <w:noProof/>
         </w:rPr>
         <w:lastRenderedPageBreak/>
         <w:drawing>
@@ -1185,6 +1190,7 @@
         <w:rPr>
           <w:b/>
           <w:bCs/>
+          <w:noProof/>
         </w:rPr>
         <w:drawing>
           <wp:inline distT="0" distB="0" distL="0" distR="0" wp14:anchorId="0581174D" wp14:editId="56323A70">
@@ -1234,6 +1240,7 @@
         <w:rPr>
           <w:b/>
           <w:bCs/>
+          <w:noProof/>
         </w:rPr>
         <w:drawing>
           <wp:inline distT="0" distB="0" distL="0" distR="0" wp14:anchorId="58BCAAA8" wp14:editId="69519C50">
@@ -1283,6 +1290,7 @@
         <w:rPr>
           <w:b/>
           <w:bCs/>
+          <w:noProof/>
         </w:rPr>
         <w:lastRenderedPageBreak/>
         <w:drawing>
@@ -1310,6 +1318,228 @@
                     <a:xfrm>
                       <a:off x="0" y="0"/>
                       <a:ext cx="5731510" cy="4116705"/>
+                    </a:xfrm>
+                    <a:prstGeom prst="rect">
+                      <a:avLst/>
+                    </a:prstGeom>
+                  </pic:spPr>
+                </pic:pic>
+              </a:graphicData>
+            </a:graphic>
+          </wp:inline>
+        </w:drawing>
+      </w:r>
+    </w:p>
+    <w:p>
+      <w:pPr>
+        <w:rPr>
+          <w:b/>
+          <w:bCs/>
+          <w:sz w:val="24"/>
+          <w:szCs w:val="24"/>
+        </w:rPr>
+      </w:pPr>
+      <w:r>
+        <w:rPr>
+          <w:b/>
+          <w:bCs/>
+          <w:sz w:val="24"/>
+          <w:szCs w:val="24"/>
+        </w:rPr>
+        <w:t>Appendix D – Design</w:t>
+      </w:r>
+    </w:p>
+    <w:p>
+      <w:pPr>
+        <w:rPr>
+          <w:b/>
+          <w:bCs/>
+        </w:rPr>
+      </w:pPr>
+      <w:r>
+        <w:rPr>
+          <w:b/>
+          <w:bCs/>
+        </w:rPr>
+        <w:t>D.1 – Interface before uploading replays</w:t>
+      </w:r>
+    </w:p>
+    <w:p>
+      <w:pPr>
+        <w:rPr>
+          <w:b/>
+          <w:bCs/>
+        </w:rPr>
+      </w:pPr>
+      <w:r>
+        <w:rPr>
+          <w:b/>
+          <w:bCs/>
+          <w:noProof/>
+          <w:sz w:val="24"/>
+          <w:szCs w:val="24"/>
+          <w:lang w:val="en-US"/>
+        </w:rPr>
+        <w:drawing>
+          <wp:inline distT="0" distB="0" distL="0" distR="0" wp14:anchorId="428DC9BE" wp14:editId="548163B3">
+            <wp:extent cx="4550410" cy="2195046"/>
+            <wp:effectExtent l="0" t="0" r="2540" b="0"/>
+            <wp:docPr id="1425974649" name="Picture 1" descr="A screenshot of a computer program&#10;&#10;AI-generated content may be incorrect."/>
+            <wp:cNvGraphicFramePr>
+              <a:graphicFrameLocks xmlns:a="http://schemas.openxmlformats.org/drawingml/2006/main" noChangeAspect="1"/>
+            </wp:cNvGraphicFramePr>
+            <a:graphic xmlns:a="http://schemas.openxmlformats.org/drawingml/2006/main">
+              <a:graphicData uri="http://schemas.openxmlformats.org/drawingml/2006/picture">
+                <pic:pic xmlns:pic="http://schemas.openxmlformats.org/drawingml/2006/picture">
+                  <pic:nvPicPr>
+                    <pic:cNvPr id="1425974649" name="Picture 1" descr="A screenshot of a computer program&#10;&#10;AI-generated content may be incorrect."/>
+                    <pic:cNvPicPr/>
+                  </pic:nvPicPr>
+                  <pic:blipFill>
+                    <a:blip r:embed="rId27"/>
+                    <a:stretch>
+                      <a:fillRect/>
+                    </a:stretch>
+                  </pic:blipFill>
+                  <pic:spPr>
+                    <a:xfrm>
+                      <a:off x="0" y="0"/>
+                      <a:ext cx="4559703" cy="2199529"/>
+                    </a:xfrm>
+                    <a:prstGeom prst="rect">
+                      <a:avLst/>
+                    </a:prstGeom>
+                  </pic:spPr>
+                </pic:pic>
+              </a:graphicData>
+            </a:graphic>
+          </wp:inline>
+        </w:drawing>
+      </w:r>
+    </w:p>
+    <w:p>
+      <w:pPr>
+        <w:rPr>
+          <w:b/>
+          <w:bCs/>
+        </w:rPr>
+      </w:pPr>
+      <w:r>
+        <w:rPr>
+          <w:b/>
+          <w:bCs/>
+        </w:rPr>
+        <w:t>D.2 – Interface after uploading replays</w:t>
+      </w:r>
+    </w:p>
+    <w:p>
+      <w:pPr>
+        <w:rPr>
+          <w:b/>
+          <w:bCs/>
+        </w:rPr>
+      </w:pPr>
+      <w:r>
+        <w:rPr>
+          <w:b/>
+          <w:bCs/>
+          <w:noProof/>
+          <w:sz w:val="24"/>
+          <w:szCs w:val="24"/>
+          <w:lang w:val="en-US"/>
+        </w:rPr>
+        <w:lastRenderedPageBreak/>
+        <w:drawing>
+          <wp:inline distT="0" distB="0" distL="0" distR="0" wp14:anchorId="6E5051E6" wp14:editId="1A62D314">
+            <wp:extent cx="4286250" cy="3623795"/>
+            <wp:effectExtent l="0" t="0" r="0" b="0"/>
+            <wp:docPr id="1115199048" name="Picture 1" descr="A screenshot of a computer program&#10;&#10;AI-generated content may be incorrect."/>
+            <wp:cNvGraphicFramePr>
+              <a:graphicFrameLocks xmlns:a="http://schemas.openxmlformats.org/drawingml/2006/main" noChangeAspect="1"/>
+            </wp:cNvGraphicFramePr>
+            <a:graphic xmlns:a="http://schemas.openxmlformats.org/drawingml/2006/main">
+              <a:graphicData uri="http://schemas.openxmlformats.org/drawingml/2006/picture">
+                <pic:pic xmlns:pic="http://schemas.openxmlformats.org/drawingml/2006/picture">
+                  <pic:nvPicPr>
+                    <pic:cNvPr id="1115199048" name="Picture 1" descr="A screenshot of a computer program&#10;&#10;AI-generated content may be incorrect."/>
+                    <pic:cNvPicPr/>
+                  </pic:nvPicPr>
+                  <pic:blipFill>
+                    <a:blip r:embed="rId28"/>
+                    <a:stretch>
+                      <a:fillRect/>
+                    </a:stretch>
+                  </pic:blipFill>
+                  <pic:spPr>
+                    <a:xfrm>
+                      <a:off x="0" y="0"/>
+                      <a:ext cx="4289327" cy="3626396"/>
+                    </a:xfrm>
+                    <a:prstGeom prst="rect">
+                      <a:avLst/>
+                    </a:prstGeom>
+                  </pic:spPr>
+                </pic:pic>
+              </a:graphicData>
+            </a:graphic>
+          </wp:inline>
+        </w:drawing>
+      </w:r>
+    </w:p>
+    <w:p>
+      <w:pPr>
+        <w:rPr>
+          <w:b/>
+          <w:bCs/>
+        </w:rPr>
+      </w:pPr>
+      <w:r>
+        <w:rPr>
+          <w:b/>
+          <w:bCs/>
+        </w:rPr>
+        <w:t>D.3 – Data Overview section basic interface</w:t>
+      </w:r>
+    </w:p>
+    <w:p>
+      <w:pPr>
+        <w:rPr>
+          <w:b/>
+          <w:bCs/>
+        </w:rPr>
+      </w:pPr>
+      <w:r>
+        <w:rPr>
+          <w:b/>
+          <w:bCs/>
+          <w:noProof/>
+          <w:lang w:val="en-US"/>
+        </w:rPr>
+        <w:drawing>
+          <wp:inline distT="0" distB="0" distL="0" distR="0" wp14:anchorId="2B8B4EDF" wp14:editId="1A5D9097">
+            <wp:extent cx="3670332" cy="3057525"/>
+            <wp:effectExtent l="0" t="0" r="6350" b="0"/>
+            <wp:docPr id="1415901833" name="Picture 1" descr="A screenshot of a computer&#10;&#10;AI-generated content may be incorrect."/>
+            <wp:cNvGraphicFramePr>
+              <a:graphicFrameLocks xmlns:a="http://schemas.openxmlformats.org/drawingml/2006/main" noChangeAspect="1"/>
+            </wp:cNvGraphicFramePr>
+            <a:graphic xmlns:a="http://schemas.openxmlformats.org/drawingml/2006/main">
+              <a:graphicData uri="http://schemas.openxmlformats.org/drawingml/2006/picture">
+                <pic:pic xmlns:pic="http://schemas.openxmlformats.org/drawingml/2006/picture">
+                  <pic:nvPicPr>
+                    <pic:cNvPr id="1415901833" name="Picture 1" descr="A screenshot of a computer&#10;&#10;AI-generated content may be incorrect."/>
+                    <pic:cNvPicPr/>
+                  </pic:nvPicPr>
+                  <pic:blipFill>
+                    <a:blip r:embed="rId29"/>
+                    <a:stretch>
+                      <a:fillRect/>
+                    </a:stretch>
+                  </pic:blipFill>
+                  <pic:spPr>
+                    <a:xfrm>
+                      <a:off x="0" y="0"/>
+                      <a:ext cx="3682721" cy="3067846"/>
                     </a:xfrm>
                     <a:prstGeom prst="rect">
                       <a:avLst/>

</xml_diff>

<commit_message>
finished implementation section in report
</commit_message>
<xml_diff>
--- a/Appendix.docx
+++ b/Appendix.docx
@@ -1443,6 +1443,7 @@
         <w:rPr>
           <w:b/>
           <w:bCs/>
+          <w:noProof/>
         </w:rPr>
         <w:lastRenderedPageBreak/>
         <w:drawing>
@@ -1487,8 +1488,83 @@
         <w:rPr>
           <w:b/>
           <w:bCs/>
-        </w:rPr>
-      </w:pPr>
+          <w:sz w:val="24"/>
+          <w:szCs w:val="24"/>
+        </w:rPr>
+      </w:pPr>
+      <w:r>
+        <w:rPr>
+          <w:b/>
+          <w:bCs/>
+          <w:sz w:val="24"/>
+          <w:szCs w:val="24"/>
+        </w:rPr>
+        <w:t>Appendix E – Implementation</w:t>
+      </w:r>
+    </w:p>
+    <w:p>
+      <w:pPr>
+        <w:rPr>
+          <w:b/>
+          <w:bCs/>
+        </w:rPr>
+      </w:pPr>
+      <w:r>
+        <w:rPr>
+          <w:b/>
+          <w:bCs/>
+        </w:rPr>
+        <w:t>Appendix E.1 - Labeller</w:t>
+      </w:r>
+    </w:p>
+    <w:p>
+      <w:pPr>
+        <w:rPr>
+          <w:b/>
+          <w:bCs/>
+        </w:rPr>
+      </w:pPr>
+      <w:r>
+        <w:rPr>
+          <w:b/>
+          <w:bCs/>
+        </w:rPr>
+        <w:drawing>
+          <wp:inline distT="0" distB="0" distL="0" distR="0" wp14:anchorId="3A273A6D" wp14:editId="7F4CDE95">
+            <wp:extent cx="5731510" cy="3648075"/>
+            <wp:effectExtent l="0" t="0" r="2540" b="9525"/>
+            <wp:docPr id="1943476810" name="Picture 1"/>
+            <wp:cNvGraphicFramePr>
+              <a:graphicFrameLocks xmlns:a="http://schemas.openxmlformats.org/drawingml/2006/main" noChangeAspect="1"/>
+            </wp:cNvGraphicFramePr>
+            <a:graphic xmlns:a="http://schemas.openxmlformats.org/drawingml/2006/main">
+              <a:graphicData uri="http://schemas.openxmlformats.org/drawingml/2006/picture">
+                <pic:pic xmlns:pic="http://schemas.openxmlformats.org/drawingml/2006/picture">
+                  <pic:nvPicPr>
+                    <pic:cNvPr id="1943476810" name=""/>
+                    <pic:cNvPicPr/>
+                  </pic:nvPicPr>
+                  <pic:blipFill>
+                    <a:blip r:embed="rId29"/>
+                    <a:stretch>
+                      <a:fillRect/>
+                    </a:stretch>
+                  </pic:blipFill>
+                  <pic:spPr>
+                    <a:xfrm>
+                      <a:off x="0" y="0"/>
+                      <a:ext cx="5731510" cy="3648075"/>
+                    </a:xfrm>
+                    <a:prstGeom prst="rect">
+                      <a:avLst/>
+                    </a:prstGeom>
+                  </pic:spPr>
+                </pic:pic>
+              </a:graphicData>
+            </a:graphic>
+          </wp:inline>
+        </w:drawing>
+      </w:r>
     </w:p>
     <w:sectPr>
       <w:pgSz w:w="11906" w:h="16838"/>

</xml_diff>

<commit_message>
finished testing (except model evaluations)
</commit_message>
<xml_diff>
--- a/Appendix.docx
+++ b/Appendix.docx
@@ -1528,6 +1528,7 @@
         <w:rPr>
           <w:b/>
           <w:bCs/>
+          <w:noProof/>
         </w:rPr>
         <w:drawing>
           <wp:inline distT="0" distB="0" distL="0" distR="0" wp14:anchorId="3A273A6D" wp14:editId="7F4CDE95">
@@ -1565,6 +1566,2458 @@
           </wp:inline>
         </w:drawing>
       </w:r>
+    </w:p>
+    <w:p>
+      <w:pPr>
+        <w:rPr>
+          <w:b/>
+          <w:bCs/>
+          <w:sz w:val="24"/>
+          <w:szCs w:val="24"/>
+        </w:rPr>
+      </w:pPr>
+      <w:r>
+        <w:rPr>
+          <w:b/>
+          <w:bCs/>
+          <w:sz w:val="24"/>
+          <w:szCs w:val="24"/>
+        </w:rPr>
+        <w:t>Appendix F – Testing</w:t>
+      </w:r>
+    </w:p>
+    <w:p>
+      <w:pPr>
+        <w:rPr>
+          <w:b/>
+          <w:bCs/>
+        </w:rPr>
+      </w:pPr>
+      <w:r>
+        <w:rPr>
+          <w:b/>
+          <w:bCs/>
+        </w:rPr>
+        <w:t>Appendix F.1 – Valid replay file</w:t>
+      </w:r>
+    </w:p>
+    <w:p>
+      <w:r>
+        <w:t>Replay name, gamemode and date:</w:t>
+      </w:r>
+    </w:p>
+    <w:p>
+      <w:pPr>
+        <w:rPr>
+          <w:b/>
+          <w:bCs/>
+        </w:rPr>
+      </w:pPr>
+      <w:r>
+        <w:rPr>
+          <w:b/>
+          <w:bCs/>
+        </w:rPr>
+        <w:drawing>
+          <wp:inline distT="0" distB="0" distL="0" distR="0" wp14:anchorId="10C3F434" wp14:editId="48689127">
+            <wp:extent cx="5731510" cy="1027430"/>
+            <wp:effectExtent l="0" t="0" r="2540" b="1270"/>
+            <wp:docPr id="1358050641" name="Picture 1"/>
+            <wp:cNvGraphicFramePr>
+              <a:graphicFrameLocks xmlns:a="http://schemas.openxmlformats.org/drawingml/2006/main" noChangeAspect="1"/>
+            </wp:cNvGraphicFramePr>
+            <a:graphic xmlns:a="http://schemas.openxmlformats.org/drawingml/2006/main">
+              <a:graphicData uri="http://schemas.openxmlformats.org/drawingml/2006/picture">
+                <pic:pic xmlns:pic="http://schemas.openxmlformats.org/drawingml/2006/picture">
+                  <pic:nvPicPr>
+                    <pic:cNvPr id="1358050641" name=""/>
+                    <pic:cNvPicPr/>
+                  </pic:nvPicPr>
+                  <pic:blipFill>
+                    <a:blip r:embed="rId30"/>
+                    <a:stretch>
+                      <a:fillRect/>
+                    </a:stretch>
+                  </pic:blipFill>
+                  <pic:spPr>
+                    <a:xfrm>
+                      <a:off x="0" y="0"/>
+                      <a:ext cx="5731510" cy="1027430"/>
+                    </a:xfrm>
+                    <a:prstGeom prst="rect">
+                      <a:avLst/>
+                    </a:prstGeom>
+                  </pic:spPr>
+                </pic:pic>
+              </a:graphicData>
+            </a:graphic>
+          </wp:inline>
+        </w:drawing>
+      </w:r>
+    </w:p>
+    <w:p>
+      <w:r>
+        <w:t>Downloaded replay file:</w:t>
+      </w:r>
+    </w:p>
+    <w:p>
+      <w:pPr>
+        <w:rPr>
+          <w:b/>
+          <w:bCs/>
+        </w:rPr>
+      </w:pPr>
+      <w:r>
+        <w:rPr>
+          <w:b/>
+          <w:bCs/>
+        </w:rPr>
+        <w:lastRenderedPageBreak/>
+        <w:drawing>
+          <wp:inline distT="0" distB="0" distL="0" distR="0" wp14:anchorId="18F8633F" wp14:editId="6D85D905">
+            <wp:extent cx="5731510" cy="284480"/>
+            <wp:effectExtent l="0" t="0" r="2540" b="1270"/>
+            <wp:docPr id="1311038679" name="Picture 1"/>
+            <wp:cNvGraphicFramePr>
+              <a:graphicFrameLocks xmlns:a="http://schemas.openxmlformats.org/drawingml/2006/main" noChangeAspect="1"/>
+            </wp:cNvGraphicFramePr>
+            <a:graphic xmlns:a="http://schemas.openxmlformats.org/drawingml/2006/main">
+              <a:graphicData uri="http://schemas.openxmlformats.org/drawingml/2006/picture">
+                <pic:pic xmlns:pic="http://schemas.openxmlformats.org/drawingml/2006/picture">
+                  <pic:nvPicPr>
+                    <pic:cNvPr id="1311038679" name=""/>
+                    <pic:cNvPicPr/>
+                  </pic:nvPicPr>
+                  <pic:blipFill>
+                    <a:blip r:embed="rId31"/>
+                    <a:stretch>
+                      <a:fillRect/>
+                    </a:stretch>
+                  </pic:blipFill>
+                  <pic:spPr>
+                    <a:xfrm>
+                      <a:off x="0" y="0"/>
+                      <a:ext cx="5731510" cy="284480"/>
+                    </a:xfrm>
+                    <a:prstGeom prst="rect">
+                      <a:avLst/>
+                    </a:prstGeom>
+                  </pic:spPr>
+                </pic:pic>
+              </a:graphicData>
+            </a:graphic>
+          </wp:inline>
+        </w:drawing>
+      </w:r>
+    </w:p>
+    <w:p>
+      <w:r>
+        <w:t>Requests made:</w:t>
+      </w:r>
+    </w:p>
+    <w:p>
+      <w:r>
+        <w:drawing>
+          <wp:inline distT="0" distB="0" distL="0" distR="0" wp14:anchorId="5CF29E5F" wp14:editId="243D7E91">
+            <wp:extent cx="5731510" cy="363220"/>
+            <wp:effectExtent l="0" t="0" r="2540" b="0"/>
+            <wp:docPr id="967271287" name="Picture 1"/>
+            <wp:cNvGraphicFramePr>
+              <a:graphicFrameLocks xmlns:a="http://schemas.openxmlformats.org/drawingml/2006/main" noChangeAspect="1"/>
+            </wp:cNvGraphicFramePr>
+            <a:graphic xmlns:a="http://schemas.openxmlformats.org/drawingml/2006/main">
+              <a:graphicData uri="http://schemas.openxmlformats.org/drawingml/2006/picture">
+                <pic:pic xmlns:pic="http://schemas.openxmlformats.org/drawingml/2006/picture">
+                  <pic:nvPicPr>
+                    <pic:cNvPr id="967271287" name=""/>
+                    <pic:cNvPicPr/>
+                  </pic:nvPicPr>
+                  <pic:blipFill>
+                    <a:blip r:embed="rId32"/>
+                    <a:stretch>
+                      <a:fillRect/>
+                    </a:stretch>
+                  </pic:blipFill>
+                  <pic:spPr>
+                    <a:xfrm>
+                      <a:off x="0" y="0"/>
+                      <a:ext cx="5731510" cy="363220"/>
+                    </a:xfrm>
+                    <a:prstGeom prst="rect">
+                      <a:avLst/>
+                    </a:prstGeom>
+                  </pic:spPr>
+                </pic:pic>
+              </a:graphicData>
+            </a:graphic>
+          </wp:inline>
+        </w:drawing>
+      </w:r>
+    </w:p>
+    <w:p>
+      <w:r>
+        <w:t>Correct details displayed on page:</w:t>
+      </w:r>
+    </w:p>
+    <w:p>
+      <w:pPr>
+        <w:rPr>
+          <w:b/>
+          <w:bCs/>
+        </w:rPr>
+      </w:pPr>
+      <w:r>
+        <w:rPr>
+          <w:b/>
+          <w:bCs/>
+        </w:rPr>
+        <w:drawing>
+          <wp:inline distT="0" distB="0" distL="0" distR="0" wp14:anchorId="64381C4A" wp14:editId="57A238F8">
+            <wp:extent cx="5611008" cy="990738"/>
+            <wp:effectExtent l="0" t="0" r="8890" b="0"/>
+            <wp:docPr id="245880930" name="Picture 1"/>
+            <wp:cNvGraphicFramePr>
+              <a:graphicFrameLocks xmlns:a="http://schemas.openxmlformats.org/drawingml/2006/main" noChangeAspect="1"/>
+            </wp:cNvGraphicFramePr>
+            <a:graphic xmlns:a="http://schemas.openxmlformats.org/drawingml/2006/main">
+              <a:graphicData uri="http://schemas.openxmlformats.org/drawingml/2006/picture">
+                <pic:pic xmlns:pic="http://schemas.openxmlformats.org/drawingml/2006/picture">
+                  <pic:nvPicPr>
+                    <pic:cNvPr id="245880930" name=""/>
+                    <pic:cNvPicPr/>
+                  </pic:nvPicPr>
+                  <pic:blipFill>
+                    <a:blip r:embed="rId33"/>
+                    <a:stretch>
+                      <a:fillRect/>
+                    </a:stretch>
+                  </pic:blipFill>
+                  <pic:spPr>
+                    <a:xfrm>
+                      <a:off x="0" y="0"/>
+                      <a:ext cx="5611008" cy="990738"/>
+                    </a:xfrm>
+                    <a:prstGeom prst="rect">
+                      <a:avLst/>
+                    </a:prstGeom>
+                  </pic:spPr>
+                </pic:pic>
+              </a:graphicData>
+            </a:graphic>
+          </wp:inline>
+        </w:drawing>
+      </w:r>
+    </w:p>
+    <w:p>
+      <w:r>
+        <w:t>Data parsed</w:t>
+      </w:r>
+      <w:r>
+        <w:t>:</w:t>
+      </w:r>
+    </w:p>
+    <w:p>
+      <w:pPr>
+        <w:rPr>
+          <w:b/>
+          <w:bCs/>
+        </w:rPr>
+      </w:pPr>
+      <w:r>
+        <w:rPr>
+          <w:b/>
+          <w:bCs/>
+        </w:rPr>
+        <w:drawing>
+          <wp:inline distT="0" distB="0" distL="0" distR="0" wp14:anchorId="2F7E6B58" wp14:editId="1FE8C9DD">
+            <wp:extent cx="3972479" cy="2876951"/>
+            <wp:effectExtent l="0" t="0" r="9525" b="0"/>
+            <wp:docPr id="1361292155" name="Picture 1"/>
+            <wp:cNvGraphicFramePr>
+              <a:graphicFrameLocks xmlns:a="http://schemas.openxmlformats.org/drawingml/2006/main" noChangeAspect="1"/>
+            </wp:cNvGraphicFramePr>
+            <a:graphic xmlns:a="http://schemas.openxmlformats.org/drawingml/2006/main">
+              <a:graphicData uri="http://schemas.openxmlformats.org/drawingml/2006/picture">
+                <pic:pic xmlns:pic="http://schemas.openxmlformats.org/drawingml/2006/picture">
+                  <pic:nvPicPr>
+                    <pic:cNvPr id="1361292155" name=""/>
+                    <pic:cNvPicPr/>
+                  </pic:nvPicPr>
+                  <pic:blipFill>
+                    <a:blip r:embed="rId34"/>
+                    <a:stretch>
+                      <a:fillRect/>
+                    </a:stretch>
+                  </pic:blipFill>
+                  <pic:spPr>
+                    <a:xfrm>
+                      <a:off x="0" y="0"/>
+                      <a:ext cx="3972479" cy="2876951"/>
+                    </a:xfrm>
+                    <a:prstGeom prst="rect">
+                      <a:avLst/>
+                    </a:prstGeom>
+                  </pic:spPr>
+                </pic:pic>
+              </a:graphicData>
+            </a:graphic>
+          </wp:inline>
+        </w:drawing>
+      </w:r>
+    </w:p>
+    <w:p>
+      <w:pPr>
+        <w:rPr>
+          <w:b/>
+          <w:bCs/>
+        </w:rPr>
+      </w:pPr>
+      <w:r>
+        <w:rPr>
+          <w:b/>
+          <w:bCs/>
+        </w:rPr>
+        <w:t>Appendix F.2 – Invalid file type</w:t>
+      </w:r>
+    </w:p>
+    <w:p>
+      <w:r>
+        <w:t>Invalid file:</w:t>
+      </w:r>
+    </w:p>
+    <w:p>
+      <w:r>
+        <w:drawing>
+          <wp:inline distT="0" distB="0" distL="0" distR="0" wp14:anchorId="3F6714C4" wp14:editId="0FAFD991">
+            <wp:extent cx="5731510" cy="264160"/>
+            <wp:effectExtent l="0" t="0" r="2540" b="2540"/>
+            <wp:docPr id="1115205380" name="Picture 1"/>
+            <wp:cNvGraphicFramePr>
+              <a:graphicFrameLocks xmlns:a="http://schemas.openxmlformats.org/drawingml/2006/main" noChangeAspect="1"/>
+            </wp:cNvGraphicFramePr>
+            <a:graphic xmlns:a="http://schemas.openxmlformats.org/drawingml/2006/main">
+              <a:graphicData uri="http://schemas.openxmlformats.org/drawingml/2006/picture">
+                <pic:pic xmlns:pic="http://schemas.openxmlformats.org/drawingml/2006/picture">
+                  <pic:nvPicPr>
+                    <pic:cNvPr id="1115205380" name=""/>
+                    <pic:cNvPicPr/>
+                  </pic:nvPicPr>
+                  <pic:blipFill>
+                    <a:blip r:embed="rId35"/>
+                    <a:stretch>
+                      <a:fillRect/>
+                    </a:stretch>
+                  </pic:blipFill>
+                  <pic:spPr>
+                    <a:xfrm>
+                      <a:off x="0" y="0"/>
+                      <a:ext cx="5731510" cy="264160"/>
+                    </a:xfrm>
+                    <a:prstGeom prst="rect">
+                      <a:avLst/>
+                    </a:prstGeom>
+                  </pic:spPr>
+                </pic:pic>
+              </a:graphicData>
+            </a:graphic>
+          </wp:inline>
+        </w:drawing>
+      </w:r>
+    </w:p>
+    <w:p>
+      <w:r>
+        <w:t>Appropriate error message:</w:t>
+      </w:r>
+    </w:p>
+    <w:p>
+      <w:r>
+        <w:drawing>
+          <wp:inline distT="0" distB="0" distL="0" distR="0" wp14:anchorId="5E8F93E5" wp14:editId="45298F68">
+            <wp:extent cx="5439534" cy="981212"/>
+            <wp:effectExtent l="0" t="0" r="8890" b="9525"/>
+            <wp:docPr id="1603184177" name="Picture 1"/>
+            <wp:cNvGraphicFramePr>
+              <a:graphicFrameLocks xmlns:a="http://schemas.openxmlformats.org/drawingml/2006/main" noChangeAspect="1"/>
+            </wp:cNvGraphicFramePr>
+            <a:graphic xmlns:a="http://schemas.openxmlformats.org/drawingml/2006/main">
+              <a:graphicData uri="http://schemas.openxmlformats.org/drawingml/2006/picture">
+                <pic:pic xmlns:pic="http://schemas.openxmlformats.org/drawingml/2006/picture">
+                  <pic:nvPicPr>
+                    <pic:cNvPr id="1603184177" name=""/>
+                    <pic:cNvPicPr/>
+                  </pic:nvPicPr>
+                  <pic:blipFill>
+                    <a:blip r:embed="rId36"/>
+                    <a:stretch>
+                      <a:fillRect/>
+                    </a:stretch>
+                  </pic:blipFill>
+                  <pic:spPr>
+                    <a:xfrm>
+                      <a:off x="0" y="0"/>
+                      <a:ext cx="5439534" cy="981212"/>
+                    </a:xfrm>
+                    <a:prstGeom prst="rect">
+                      <a:avLst/>
+                    </a:prstGeom>
+                  </pic:spPr>
+                </pic:pic>
+              </a:graphicData>
+            </a:graphic>
+          </wp:inline>
+        </w:drawing>
+      </w:r>
+    </w:p>
+    <w:p>
+      <w:pPr>
+        <w:rPr>
+          <w:b/>
+          <w:bCs/>
+        </w:rPr>
+      </w:pPr>
+      <w:r>
+        <w:rPr>
+          <w:b/>
+          <w:bCs/>
+        </w:rPr>
+        <w:t>Appendix F.3 – Duplicate replay</w:t>
+      </w:r>
+    </w:p>
+    <w:p>
+      <w:r>
+        <w:lastRenderedPageBreak/>
+        <w:drawing>
+          <wp:inline distT="0" distB="0" distL="0" distR="0" wp14:anchorId="58076509" wp14:editId="2EBBF3C5">
+            <wp:extent cx="5210902" cy="609685"/>
+            <wp:effectExtent l="0" t="0" r="8890" b="0"/>
+            <wp:docPr id="1457178691" name="Picture 1"/>
+            <wp:cNvGraphicFramePr>
+              <a:graphicFrameLocks xmlns:a="http://schemas.openxmlformats.org/drawingml/2006/main" noChangeAspect="1"/>
+            </wp:cNvGraphicFramePr>
+            <a:graphic xmlns:a="http://schemas.openxmlformats.org/drawingml/2006/main">
+              <a:graphicData uri="http://schemas.openxmlformats.org/drawingml/2006/picture">
+                <pic:pic xmlns:pic="http://schemas.openxmlformats.org/drawingml/2006/picture">
+                  <pic:nvPicPr>
+                    <pic:cNvPr id="1457178691" name=""/>
+                    <pic:cNvPicPr/>
+                  </pic:nvPicPr>
+                  <pic:blipFill>
+                    <a:blip r:embed="rId37"/>
+                    <a:stretch>
+                      <a:fillRect/>
+                    </a:stretch>
+                  </pic:blipFill>
+                  <pic:spPr>
+                    <a:xfrm>
+                      <a:off x="0" y="0"/>
+                      <a:ext cx="5210902" cy="609685"/>
+                    </a:xfrm>
+                    <a:prstGeom prst="rect">
+                      <a:avLst/>
+                    </a:prstGeom>
+                  </pic:spPr>
+                </pic:pic>
+              </a:graphicData>
+            </a:graphic>
+          </wp:inline>
+        </w:drawing>
+      </w:r>
+    </w:p>
+    <w:p>
+      <w:r>
+        <w:drawing>
+          <wp:inline distT="0" distB="0" distL="0" distR="0" wp14:anchorId="6580681D" wp14:editId="524E1700">
+            <wp:extent cx="5731510" cy="261620"/>
+            <wp:effectExtent l="0" t="0" r="2540" b="5080"/>
+            <wp:docPr id="1928753484" name="Picture 1"/>
+            <wp:cNvGraphicFramePr>
+              <a:graphicFrameLocks xmlns:a="http://schemas.openxmlformats.org/drawingml/2006/main" noChangeAspect="1"/>
+            </wp:cNvGraphicFramePr>
+            <a:graphic xmlns:a="http://schemas.openxmlformats.org/drawingml/2006/main">
+              <a:graphicData uri="http://schemas.openxmlformats.org/drawingml/2006/picture">
+                <pic:pic xmlns:pic="http://schemas.openxmlformats.org/drawingml/2006/picture">
+                  <pic:nvPicPr>
+                    <pic:cNvPr id="1928753484" name=""/>
+                    <pic:cNvPicPr/>
+                  </pic:nvPicPr>
+                  <pic:blipFill>
+                    <a:blip r:embed="rId38"/>
+                    <a:stretch>
+                      <a:fillRect/>
+                    </a:stretch>
+                  </pic:blipFill>
+                  <pic:spPr>
+                    <a:xfrm>
+                      <a:off x="0" y="0"/>
+                      <a:ext cx="5731510" cy="261620"/>
+                    </a:xfrm>
+                    <a:prstGeom prst="rect">
+                      <a:avLst/>
+                    </a:prstGeom>
+                  </pic:spPr>
+                </pic:pic>
+              </a:graphicData>
+            </a:graphic>
+          </wp:inline>
+        </w:drawing>
+      </w:r>
+    </w:p>
+    <w:p>
+      <w:r>
+        <w:t>Only 1</w:t>
+      </w:r>
+      <w:r>
+        <w:t xml:space="preserve"> replay</w:t>
+      </w:r>
+      <w:r>
+        <w:t xml:space="preserve"> stays:</w:t>
+      </w:r>
+    </w:p>
+    <w:p>
+      <w:r>
+        <w:drawing>
+          <wp:inline distT="0" distB="0" distL="0" distR="0" wp14:anchorId="5B367F5F" wp14:editId="54C144F7">
+            <wp:extent cx="5515745" cy="2800741"/>
+            <wp:effectExtent l="0" t="0" r="8890" b="0"/>
+            <wp:docPr id="931043476" name="Picture 1"/>
+            <wp:cNvGraphicFramePr>
+              <a:graphicFrameLocks xmlns:a="http://schemas.openxmlformats.org/drawingml/2006/main" noChangeAspect="1"/>
+            </wp:cNvGraphicFramePr>
+            <a:graphic xmlns:a="http://schemas.openxmlformats.org/drawingml/2006/main">
+              <a:graphicData uri="http://schemas.openxmlformats.org/drawingml/2006/picture">
+                <pic:pic xmlns:pic="http://schemas.openxmlformats.org/drawingml/2006/picture">
+                  <pic:nvPicPr>
+                    <pic:cNvPr id="931043476" name=""/>
+                    <pic:cNvPicPr/>
+                  </pic:nvPicPr>
+                  <pic:blipFill>
+                    <a:blip r:embed="rId39"/>
+                    <a:stretch>
+                      <a:fillRect/>
+                    </a:stretch>
+                  </pic:blipFill>
+                  <pic:spPr>
+                    <a:xfrm>
+                      <a:off x="0" y="0"/>
+                      <a:ext cx="5515745" cy="2800741"/>
+                    </a:xfrm>
+                    <a:prstGeom prst="rect">
+                      <a:avLst/>
+                    </a:prstGeom>
+                  </pic:spPr>
+                </pic:pic>
+              </a:graphicData>
+            </a:graphic>
+          </wp:inline>
+        </w:drawing>
+      </w:r>
+    </w:p>
+    <w:p>
+      <w:pPr>
+        <w:rPr>
+          <w:b/>
+          <w:bCs/>
+        </w:rPr>
+      </w:pPr>
+      <w:r>
+        <w:rPr>
+          <w:b/>
+          <w:bCs/>
+        </w:rPr>
+        <w:t>Appendix F.4 – Valid Ballchasing URL/ID</w:t>
+      </w:r>
+    </w:p>
+    <w:p>
+      <w:r>
+        <w:drawing>
+          <wp:inline distT="0" distB="0" distL="0" distR="0" wp14:anchorId="1AD5F484" wp14:editId="36EA2DC8">
+            <wp:extent cx="5731510" cy="684530"/>
+            <wp:effectExtent l="0" t="0" r="2540" b="1270"/>
+            <wp:docPr id="1528156460" name="Picture 1"/>
+            <wp:cNvGraphicFramePr>
+              <a:graphicFrameLocks xmlns:a="http://schemas.openxmlformats.org/drawingml/2006/main" noChangeAspect="1"/>
+            </wp:cNvGraphicFramePr>
+            <a:graphic xmlns:a="http://schemas.openxmlformats.org/drawingml/2006/main">
+              <a:graphicData uri="http://schemas.openxmlformats.org/drawingml/2006/picture">
+                <pic:pic xmlns:pic="http://schemas.openxmlformats.org/drawingml/2006/picture">
+                  <pic:nvPicPr>
+                    <pic:cNvPr id="1528156460" name=""/>
+                    <pic:cNvPicPr/>
+                  </pic:nvPicPr>
+                  <pic:blipFill>
+                    <a:blip r:embed="rId40"/>
+                    <a:stretch>
+                      <a:fillRect/>
+                    </a:stretch>
+                  </pic:blipFill>
+                  <pic:spPr>
+                    <a:xfrm>
+                      <a:off x="0" y="0"/>
+                      <a:ext cx="5731510" cy="684530"/>
+                    </a:xfrm>
+                    <a:prstGeom prst="rect">
+                      <a:avLst/>
+                    </a:prstGeom>
+                  </pic:spPr>
+                </pic:pic>
+              </a:graphicData>
+            </a:graphic>
+          </wp:inline>
+        </w:drawing>
+      </w:r>
+    </w:p>
+    <w:p>
+      <w:r>
+        <w:drawing>
+          <wp:inline distT="0" distB="0" distL="0" distR="0" wp14:anchorId="4DEB2CAD" wp14:editId="521DCEAD">
+            <wp:extent cx="3943900" cy="514422"/>
+            <wp:effectExtent l="0" t="0" r="0" b="0"/>
+            <wp:docPr id="1362044152" name="Picture 1"/>
+            <wp:cNvGraphicFramePr>
+              <a:graphicFrameLocks xmlns:a="http://schemas.openxmlformats.org/drawingml/2006/main" noChangeAspect="1"/>
+            </wp:cNvGraphicFramePr>
+            <a:graphic xmlns:a="http://schemas.openxmlformats.org/drawingml/2006/main">
+              <a:graphicData uri="http://schemas.openxmlformats.org/drawingml/2006/picture">
+                <pic:pic xmlns:pic="http://schemas.openxmlformats.org/drawingml/2006/picture">
+                  <pic:nvPicPr>
+                    <pic:cNvPr id="1362044152" name=""/>
+                    <pic:cNvPicPr/>
+                  </pic:nvPicPr>
+                  <pic:blipFill>
+                    <a:blip r:embed="rId41"/>
+                    <a:stretch>
+                      <a:fillRect/>
+                    </a:stretch>
+                  </pic:blipFill>
+                  <pic:spPr>
+                    <a:xfrm>
+                      <a:off x="0" y="0"/>
+                      <a:ext cx="3943900" cy="514422"/>
+                    </a:xfrm>
+                    <a:prstGeom prst="rect">
+                      <a:avLst/>
+                    </a:prstGeom>
+                  </pic:spPr>
+                </pic:pic>
+              </a:graphicData>
+            </a:graphic>
+          </wp:inline>
+        </w:drawing>
+      </w:r>
+    </w:p>
+    <w:p>
+      <w:r>
+        <w:drawing>
+          <wp:inline distT="0" distB="0" distL="0" distR="0" wp14:anchorId="680FBF43" wp14:editId="3F296E38">
+            <wp:extent cx="3943900" cy="476316"/>
+            <wp:effectExtent l="0" t="0" r="0" b="0"/>
+            <wp:docPr id="1093965019" name="Picture 1"/>
+            <wp:cNvGraphicFramePr>
+              <a:graphicFrameLocks xmlns:a="http://schemas.openxmlformats.org/drawingml/2006/main" noChangeAspect="1"/>
+            </wp:cNvGraphicFramePr>
+            <a:graphic xmlns:a="http://schemas.openxmlformats.org/drawingml/2006/main">
+              <a:graphicData uri="http://schemas.openxmlformats.org/drawingml/2006/picture">
+                <pic:pic xmlns:pic="http://schemas.openxmlformats.org/drawingml/2006/picture">
+                  <pic:nvPicPr>
+                    <pic:cNvPr id="1093965019" name=""/>
+                    <pic:cNvPicPr/>
+                  </pic:nvPicPr>
+                  <pic:blipFill>
+                    <a:blip r:embed="rId42"/>
+                    <a:stretch>
+                      <a:fillRect/>
+                    </a:stretch>
+                  </pic:blipFill>
+                  <pic:spPr>
+                    <a:xfrm>
+                      <a:off x="0" y="0"/>
+                      <a:ext cx="3943900" cy="476316"/>
+                    </a:xfrm>
+                    <a:prstGeom prst="rect">
+                      <a:avLst/>
+                    </a:prstGeom>
+                  </pic:spPr>
+                </pic:pic>
+              </a:graphicData>
+            </a:graphic>
+          </wp:inline>
+        </w:drawing>
+      </w:r>
+    </w:p>
+    <w:p>
+      <w:r>
+        <w:drawing>
+          <wp:inline distT="0" distB="0" distL="0" distR="0" wp14:anchorId="3DA683CD" wp14:editId="381B2EA2">
+            <wp:extent cx="5210902" cy="647790"/>
+            <wp:effectExtent l="0" t="0" r="8890" b="0"/>
+            <wp:docPr id="33139555" name="Picture 1"/>
+            <wp:cNvGraphicFramePr>
+              <a:graphicFrameLocks xmlns:a="http://schemas.openxmlformats.org/drawingml/2006/main" noChangeAspect="1"/>
+            </wp:cNvGraphicFramePr>
+            <a:graphic xmlns:a="http://schemas.openxmlformats.org/drawingml/2006/main">
+              <a:graphicData uri="http://schemas.openxmlformats.org/drawingml/2006/picture">
+                <pic:pic xmlns:pic="http://schemas.openxmlformats.org/drawingml/2006/picture">
+                  <pic:nvPicPr>
+                    <pic:cNvPr id="33139555" name=""/>
+                    <pic:cNvPicPr/>
+                  </pic:nvPicPr>
+                  <pic:blipFill>
+                    <a:blip r:embed="rId43"/>
+                    <a:stretch>
+                      <a:fillRect/>
+                    </a:stretch>
+                  </pic:blipFill>
+                  <pic:spPr>
+                    <a:xfrm>
+                      <a:off x="0" y="0"/>
+                      <a:ext cx="5210902" cy="647790"/>
+                    </a:xfrm>
+                    <a:prstGeom prst="rect">
+                      <a:avLst/>
+                    </a:prstGeom>
+                  </pic:spPr>
+                </pic:pic>
+              </a:graphicData>
+            </a:graphic>
+          </wp:inline>
+        </w:drawing>
+      </w:r>
+    </w:p>
+    <w:p>
+      <w:r>
+        <w:lastRenderedPageBreak/>
+        <w:drawing>
+          <wp:inline distT="0" distB="0" distL="0" distR="0" wp14:anchorId="3EBBDC29" wp14:editId="47F9E94F">
+            <wp:extent cx="3924848" cy="1943371"/>
+            <wp:effectExtent l="0" t="0" r="0" b="0"/>
+            <wp:docPr id="157551629" name="Picture 1"/>
+            <wp:cNvGraphicFramePr>
+              <a:graphicFrameLocks xmlns:a="http://schemas.openxmlformats.org/drawingml/2006/main" noChangeAspect="1"/>
+            </wp:cNvGraphicFramePr>
+            <a:graphic xmlns:a="http://schemas.openxmlformats.org/drawingml/2006/main">
+              <a:graphicData uri="http://schemas.openxmlformats.org/drawingml/2006/picture">
+                <pic:pic xmlns:pic="http://schemas.openxmlformats.org/drawingml/2006/picture">
+                  <pic:nvPicPr>
+                    <pic:cNvPr id="157551629" name=""/>
+                    <pic:cNvPicPr/>
+                  </pic:nvPicPr>
+                  <pic:blipFill>
+                    <a:blip r:embed="rId44"/>
+                    <a:stretch>
+                      <a:fillRect/>
+                    </a:stretch>
+                  </pic:blipFill>
+                  <pic:spPr>
+                    <a:xfrm>
+                      <a:off x="0" y="0"/>
+                      <a:ext cx="3924848" cy="1943371"/>
+                    </a:xfrm>
+                    <a:prstGeom prst="rect">
+                      <a:avLst/>
+                    </a:prstGeom>
+                  </pic:spPr>
+                </pic:pic>
+              </a:graphicData>
+            </a:graphic>
+          </wp:inline>
+        </w:drawing>
+      </w:r>
+    </w:p>
+    <w:p>
+      <w:r>
+        <w:t>(note that Game ID != Ballchasing ID)</w:t>
+      </w:r>
+    </w:p>
+    <w:p>
+      <w:pPr>
+        <w:rPr>
+          <w:b/>
+          <w:bCs/>
+        </w:rPr>
+      </w:pPr>
+      <w:r>
+        <w:rPr>
+          <w:b/>
+          <w:bCs/>
+        </w:rPr>
+        <w:t>Appendix F.</w:t>
+      </w:r>
+      <w:r>
+        <w:rPr>
+          <w:b/>
+          <w:bCs/>
+        </w:rPr>
+        <w:t xml:space="preserve">5 </w:t>
+      </w:r>
+      <w:r>
+        <w:rPr>
+          <w:b/>
+          <w:bCs/>
+        </w:rPr>
+        <w:t>– Invalid Ballchasing URL/ID</w:t>
+      </w:r>
+    </w:p>
+    <w:p>
+      <w:pPr>
+        <w:rPr>
+          <w:b/>
+          <w:bCs/>
+        </w:rPr>
+      </w:pPr>
+      <w:r>
+        <w:rPr>
+          <w:b/>
+          <w:bCs/>
+        </w:rPr>
+        <w:drawing>
+          <wp:inline distT="0" distB="0" distL="0" distR="0" wp14:anchorId="530A5F04" wp14:editId="4FEBF671">
+            <wp:extent cx="3953427" cy="476316"/>
+            <wp:effectExtent l="0" t="0" r="9525" b="0"/>
+            <wp:docPr id="464052442" name="Picture 1"/>
+            <wp:cNvGraphicFramePr>
+              <a:graphicFrameLocks xmlns:a="http://schemas.openxmlformats.org/drawingml/2006/main" noChangeAspect="1"/>
+            </wp:cNvGraphicFramePr>
+            <a:graphic xmlns:a="http://schemas.openxmlformats.org/drawingml/2006/main">
+              <a:graphicData uri="http://schemas.openxmlformats.org/drawingml/2006/picture">
+                <pic:pic xmlns:pic="http://schemas.openxmlformats.org/drawingml/2006/picture">
+                  <pic:nvPicPr>
+                    <pic:cNvPr id="464052442" name=""/>
+                    <pic:cNvPicPr/>
+                  </pic:nvPicPr>
+                  <pic:blipFill>
+                    <a:blip r:embed="rId45"/>
+                    <a:stretch>
+                      <a:fillRect/>
+                    </a:stretch>
+                  </pic:blipFill>
+                  <pic:spPr>
+                    <a:xfrm>
+                      <a:off x="0" y="0"/>
+                      <a:ext cx="3953427" cy="476316"/>
+                    </a:xfrm>
+                    <a:prstGeom prst="rect">
+                      <a:avLst/>
+                    </a:prstGeom>
+                  </pic:spPr>
+                </pic:pic>
+              </a:graphicData>
+            </a:graphic>
+          </wp:inline>
+        </w:drawing>
+      </w:r>
+    </w:p>
+    <w:p>
+      <w:pPr>
+        <w:rPr>
+          <w:b/>
+          <w:bCs/>
+        </w:rPr>
+      </w:pPr>
+      <w:r>
+        <w:rPr>
+          <w:b/>
+          <w:bCs/>
+        </w:rPr>
+        <w:drawing>
+          <wp:inline distT="0" distB="0" distL="0" distR="0" wp14:anchorId="1A9FD9B8" wp14:editId="017023F1">
+            <wp:extent cx="2410161" cy="428685"/>
+            <wp:effectExtent l="0" t="0" r="0" b="9525"/>
+            <wp:docPr id="59792066" name="Picture 1"/>
+            <wp:cNvGraphicFramePr>
+              <a:graphicFrameLocks xmlns:a="http://schemas.openxmlformats.org/drawingml/2006/main" noChangeAspect="1"/>
+            </wp:cNvGraphicFramePr>
+            <a:graphic xmlns:a="http://schemas.openxmlformats.org/drawingml/2006/main">
+              <a:graphicData uri="http://schemas.openxmlformats.org/drawingml/2006/picture">
+                <pic:pic xmlns:pic="http://schemas.openxmlformats.org/drawingml/2006/picture">
+                  <pic:nvPicPr>
+                    <pic:cNvPr id="59792066" name=""/>
+                    <pic:cNvPicPr/>
+                  </pic:nvPicPr>
+                  <pic:blipFill>
+                    <a:blip r:embed="rId46"/>
+                    <a:stretch>
+                      <a:fillRect/>
+                    </a:stretch>
+                  </pic:blipFill>
+                  <pic:spPr>
+                    <a:xfrm>
+                      <a:off x="0" y="0"/>
+                      <a:ext cx="2410161" cy="428685"/>
+                    </a:xfrm>
+                    <a:prstGeom prst="rect">
+                      <a:avLst/>
+                    </a:prstGeom>
+                  </pic:spPr>
+                </pic:pic>
+              </a:graphicData>
+            </a:graphic>
+          </wp:inline>
+        </w:drawing>
+      </w:r>
+    </w:p>
+    <w:p>
+      <w:pPr>
+        <w:rPr>
+          <w:b/>
+          <w:bCs/>
+        </w:rPr>
+      </w:pPr>
+      <w:r>
+        <w:rPr>
+          <w:b/>
+          <w:bCs/>
+        </w:rPr>
+        <w:t>Appendix F.</w:t>
+      </w:r>
+      <w:r>
+        <w:rPr>
+          <w:b/>
+          <w:bCs/>
+        </w:rPr>
+        <w:t>6</w:t>
+      </w:r>
+      <w:r>
+        <w:rPr>
+          <w:b/>
+          <w:bCs/>
+        </w:rPr>
+        <w:t xml:space="preserve"> – No replays or missing player/rank selection on submit</w:t>
+      </w:r>
+    </w:p>
+    <w:p>
+      <w:pPr>
+        <w:rPr>
+          <w:b/>
+          <w:bCs/>
+        </w:rPr>
+      </w:pPr>
+      <w:r>
+        <w:rPr>
+          <w:b/>
+          <w:bCs/>
+        </w:rPr>
+        <w:drawing>
+          <wp:inline distT="0" distB="0" distL="0" distR="0" wp14:anchorId="67E31C12" wp14:editId="0EB8CF89">
+            <wp:extent cx="1905266" cy="1933845"/>
+            <wp:effectExtent l="0" t="0" r="0" b="9525"/>
+            <wp:docPr id="1348234352" name="Picture 1"/>
+            <wp:cNvGraphicFramePr>
+              <a:graphicFrameLocks xmlns:a="http://schemas.openxmlformats.org/drawingml/2006/main" noChangeAspect="1"/>
+            </wp:cNvGraphicFramePr>
+            <a:graphic xmlns:a="http://schemas.openxmlformats.org/drawingml/2006/main">
+              <a:graphicData uri="http://schemas.openxmlformats.org/drawingml/2006/picture">
+                <pic:pic xmlns:pic="http://schemas.openxmlformats.org/drawingml/2006/picture">
+                  <pic:nvPicPr>
+                    <pic:cNvPr id="1348234352" name=""/>
+                    <pic:cNvPicPr/>
+                  </pic:nvPicPr>
+                  <pic:blipFill>
+                    <a:blip r:embed="rId47"/>
+                    <a:stretch>
+                      <a:fillRect/>
+                    </a:stretch>
+                  </pic:blipFill>
+                  <pic:spPr>
+                    <a:xfrm>
+                      <a:off x="0" y="0"/>
+                      <a:ext cx="1905266" cy="1933845"/>
+                    </a:xfrm>
+                    <a:prstGeom prst="rect">
+                      <a:avLst/>
+                    </a:prstGeom>
+                  </pic:spPr>
+                </pic:pic>
+              </a:graphicData>
+            </a:graphic>
+          </wp:inline>
+        </w:drawing>
+      </w:r>
+      <w:r>
+        <w:rPr>
+          <w:b/>
+          <w:bCs/>
+        </w:rPr>
+        <w:drawing>
+          <wp:inline distT="0" distB="0" distL="0" distR="0" wp14:anchorId="5AD24E22" wp14:editId="72A38D8A">
+            <wp:extent cx="1771897" cy="1933845"/>
+            <wp:effectExtent l="0" t="0" r="0" b="9525"/>
+            <wp:docPr id="1409257696" name="Picture 1"/>
+            <wp:cNvGraphicFramePr>
+              <a:graphicFrameLocks xmlns:a="http://schemas.openxmlformats.org/drawingml/2006/main" noChangeAspect="1"/>
+            </wp:cNvGraphicFramePr>
+            <a:graphic xmlns:a="http://schemas.openxmlformats.org/drawingml/2006/main">
+              <a:graphicData uri="http://schemas.openxmlformats.org/drawingml/2006/picture">
+                <pic:pic xmlns:pic="http://schemas.openxmlformats.org/drawingml/2006/picture">
+                  <pic:nvPicPr>
+                    <pic:cNvPr id="1409257696" name=""/>
+                    <pic:cNvPicPr/>
+                  </pic:nvPicPr>
+                  <pic:blipFill>
+                    <a:blip r:embed="rId48"/>
+                    <a:stretch>
+                      <a:fillRect/>
+                    </a:stretch>
+                  </pic:blipFill>
+                  <pic:spPr>
+                    <a:xfrm>
+                      <a:off x="0" y="0"/>
+                      <a:ext cx="1771897" cy="1933845"/>
+                    </a:xfrm>
+                    <a:prstGeom prst="rect">
+                      <a:avLst/>
+                    </a:prstGeom>
+                  </pic:spPr>
+                </pic:pic>
+              </a:graphicData>
+            </a:graphic>
+          </wp:inline>
+        </w:drawing>
+      </w:r>
+      <w:r>
+        <w:rPr>
+          <w:noProof/>
+        </w:rPr>
+        <w:t xml:space="preserve"> </w:t>
+      </w:r>
+    </w:p>
+    <w:p>
+      <w:pPr>
+        <w:rPr>
+          <w:b/>
+          <w:bCs/>
+        </w:rPr>
+      </w:pPr>
+      <w:r>
+        <w:rPr>
+          <w:b/>
+          <w:bCs/>
+        </w:rPr>
+        <w:t>Appendix</w:t>
+      </w:r>
+      <w:r>
+        <w:rPr>
+          <w:b/>
+          <w:bCs/>
+        </w:rPr>
+        <w:t xml:space="preserve"> F.</w:t>
+      </w:r>
+      <w:r>
+        <w:rPr>
+          <w:b/>
+          <w:bCs/>
+        </w:rPr>
+        <w:t>7</w:t>
+      </w:r>
+      <w:r>
+        <w:rPr>
+          <w:b/>
+          <w:bCs/>
+        </w:rPr>
+        <w:t xml:space="preserve"> – Caching works</w:t>
+      </w:r>
+    </w:p>
+    <w:p>
+      <w:pPr>
+        <w:rPr>
+          <w:b/>
+          <w:bCs/>
+        </w:rPr>
+      </w:pPr>
+      <w:r>
+        <w:rPr>
+          <w:b/>
+          <w:bCs/>
+        </w:rPr>
+        <w:drawing>
+          <wp:inline distT="0" distB="0" distL="0" distR="0" wp14:anchorId="26110B50" wp14:editId="76EBB5AE">
+            <wp:extent cx="5306165" cy="495369"/>
+            <wp:effectExtent l="0" t="0" r="8890" b="0"/>
+            <wp:docPr id="542518941" name="Picture 1"/>
+            <wp:cNvGraphicFramePr>
+              <a:graphicFrameLocks xmlns:a="http://schemas.openxmlformats.org/drawingml/2006/main" noChangeAspect="1"/>
+            </wp:cNvGraphicFramePr>
+            <a:graphic xmlns:a="http://schemas.openxmlformats.org/drawingml/2006/main">
+              <a:graphicData uri="http://schemas.openxmlformats.org/drawingml/2006/picture">
+                <pic:pic xmlns:pic="http://schemas.openxmlformats.org/drawingml/2006/picture">
+                  <pic:nvPicPr>
+                    <pic:cNvPr id="542518941" name=""/>
+                    <pic:cNvPicPr/>
+                  </pic:nvPicPr>
+                  <pic:blipFill>
+                    <a:blip r:embed="rId49"/>
+                    <a:stretch>
+                      <a:fillRect/>
+                    </a:stretch>
+                  </pic:blipFill>
+                  <pic:spPr>
+                    <a:xfrm>
+                      <a:off x="0" y="0"/>
+                      <a:ext cx="5306165" cy="495369"/>
+                    </a:xfrm>
+                    <a:prstGeom prst="rect">
+                      <a:avLst/>
+                    </a:prstGeom>
+                  </pic:spPr>
+                </pic:pic>
+              </a:graphicData>
+            </a:graphic>
+          </wp:inline>
+        </w:drawing>
+      </w:r>
+    </w:p>
+    <w:p>
+      <w:pPr>
+        <w:rPr>
+          <w:b/>
+          <w:bCs/>
+        </w:rPr>
+      </w:pPr>
+      <w:r>
+        <w:rPr>
+          <w:b/>
+          <w:bCs/>
+        </w:rPr>
+        <w:drawing>
+          <wp:inline distT="0" distB="0" distL="0" distR="0" wp14:anchorId="42516135" wp14:editId="171F1CA4">
+            <wp:extent cx="5731510" cy="162560"/>
+            <wp:effectExtent l="0" t="0" r="2540" b="8890"/>
+            <wp:docPr id="966102562" name="Picture 1"/>
+            <wp:cNvGraphicFramePr>
+              <a:graphicFrameLocks xmlns:a="http://schemas.openxmlformats.org/drawingml/2006/main" noChangeAspect="1"/>
+            </wp:cNvGraphicFramePr>
+            <a:graphic xmlns:a="http://schemas.openxmlformats.org/drawingml/2006/main">
+              <a:graphicData uri="http://schemas.openxmlformats.org/drawingml/2006/picture">
+                <pic:pic xmlns:pic="http://schemas.openxmlformats.org/drawingml/2006/picture">
+                  <pic:nvPicPr>
+                    <pic:cNvPr id="966102562" name=""/>
+                    <pic:cNvPicPr/>
+                  </pic:nvPicPr>
+                  <pic:blipFill>
+                    <a:blip r:embed="rId50"/>
+                    <a:stretch>
+                      <a:fillRect/>
+                    </a:stretch>
+                  </pic:blipFill>
+                  <pic:spPr>
+                    <a:xfrm>
+                      <a:off x="0" y="0"/>
+                      <a:ext cx="5731510" cy="162560"/>
+                    </a:xfrm>
+                    <a:prstGeom prst="rect">
+                      <a:avLst/>
+                    </a:prstGeom>
+                  </pic:spPr>
+                </pic:pic>
+              </a:graphicData>
+            </a:graphic>
+          </wp:inline>
+        </w:drawing>
+      </w:r>
+    </w:p>
+    <w:p>
+      <w:r>
+        <w:t>Only header request made (no parsing):</w:t>
+      </w:r>
+    </w:p>
+    <w:p>
+      <w:pPr>
+        <w:rPr>
+          <w:b/>
+          <w:bCs/>
+        </w:rPr>
+      </w:pPr>
+      <w:r>
+        <w:rPr>
+          <w:b/>
+          <w:bCs/>
+        </w:rPr>
+        <w:drawing>
+          <wp:inline distT="0" distB="0" distL="0" distR="0" wp14:anchorId="4937E06E" wp14:editId="01C2903F">
+            <wp:extent cx="5731510" cy="537845"/>
+            <wp:effectExtent l="0" t="0" r="2540" b="0"/>
+            <wp:docPr id="512860353" name="Picture 1"/>
+            <wp:cNvGraphicFramePr>
+              <a:graphicFrameLocks xmlns:a="http://schemas.openxmlformats.org/drawingml/2006/main" noChangeAspect="1"/>
+            </wp:cNvGraphicFramePr>
+            <a:graphic xmlns:a="http://schemas.openxmlformats.org/drawingml/2006/main">
+              <a:graphicData uri="http://schemas.openxmlformats.org/drawingml/2006/picture">
+                <pic:pic xmlns:pic="http://schemas.openxmlformats.org/drawingml/2006/picture">
+                  <pic:nvPicPr>
+                    <pic:cNvPr id="512860353" name=""/>
+                    <pic:cNvPicPr/>
+                  </pic:nvPicPr>
+                  <pic:blipFill>
+                    <a:blip r:embed="rId51"/>
+                    <a:stretch>
+                      <a:fillRect/>
+                    </a:stretch>
+                  </pic:blipFill>
+                  <pic:spPr>
+                    <a:xfrm>
+                      <a:off x="0" y="0"/>
+                      <a:ext cx="5731510" cy="537845"/>
+                    </a:xfrm>
+                    <a:prstGeom prst="rect">
+                      <a:avLst/>
+                    </a:prstGeom>
+                  </pic:spPr>
+                </pic:pic>
+              </a:graphicData>
+            </a:graphic>
+          </wp:inline>
+        </w:drawing>
+      </w:r>
+    </w:p>
+    <w:p>
+      <w:pPr>
+        <w:rPr>
+          <w:b/>
+          <w:bCs/>
+        </w:rPr>
+      </w:pPr>
+      <w:r>
+        <w:rPr>
+          <w:b/>
+          <w:bCs/>
+        </w:rPr>
+        <w:drawing>
+          <wp:inline distT="0" distB="0" distL="0" distR="0" wp14:anchorId="04424FB5" wp14:editId="7EF892AA">
+            <wp:extent cx="3639058" cy="381053"/>
+            <wp:effectExtent l="0" t="0" r="0" b="0"/>
+            <wp:docPr id="1217590807" name="Picture 1"/>
+            <wp:cNvGraphicFramePr>
+              <a:graphicFrameLocks xmlns:a="http://schemas.openxmlformats.org/drawingml/2006/main" noChangeAspect="1"/>
+            </wp:cNvGraphicFramePr>
+            <a:graphic xmlns:a="http://schemas.openxmlformats.org/drawingml/2006/main">
+              <a:graphicData uri="http://schemas.openxmlformats.org/drawingml/2006/picture">
+                <pic:pic xmlns:pic="http://schemas.openxmlformats.org/drawingml/2006/picture">
+                  <pic:nvPicPr>
+                    <pic:cNvPr id="1217590807" name=""/>
+                    <pic:cNvPicPr/>
+                  </pic:nvPicPr>
+                  <pic:blipFill>
+                    <a:blip r:embed="rId52"/>
+                    <a:stretch>
+                      <a:fillRect/>
+                    </a:stretch>
+                  </pic:blipFill>
+                  <pic:spPr>
+                    <a:xfrm>
+                      <a:off x="0" y="0"/>
+                      <a:ext cx="3639058" cy="381053"/>
+                    </a:xfrm>
+                    <a:prstGeom prst="rect">
+                      <a:avLst/>
+                    </a:prstGeom>
+                  </pic:spPr>
+                </pic:pic>
+              </a:graphicData>
+            </a:graphic>
+          </wp:inline>
+        </w:drawing>
+      </w:r>
+    </w:p>
+    <w:p>
+      <w:pPr>
+        <w:rPr>
+          <w:b/>
+          <w:bCs/>
+        </w:rPr>
+      </w:pPr>
+      <w:r>
+        <w:rPr>
+          <w:b/>
+          <w:bCs/>
+        </w:rPr>
+        <w:lastRenderedPageBreak/>
+        <w:t>Appendix</w:t>
+      </w:r>
+      <w:r>
+        <w:rPr>
+          <w:b/>
+          <w:bCs/>
+        </w:rPr>
+        <w:t xml:space="preserve"> F.</w:t>
+      </w:r>
+      <w:r>
+        <w:rPr>
+          <w:b/>
+          <w:bCs/>
+        </w:rPr>
+        <w:t>8</w:t>
+      </w:r>
+      <w:r>
+        <w:rPr>
+          <w:b/>
+          <w:bCs/>
+        </w:rPr>
+        <w:t xml:space="preserve"> – Deleting replays</w:t>
+      </w:r>
+    </w:p>
+    <w:p>
+      <w:r>
+        <w:rPr>
+          <w:b/>
+          <w:bCs/>
+        </w:rPr>
+        <w:drawing>
+          <wp:inline distT="0" distB="0" distL="0" distR="0" wp14:anchorId="60B9FAE9" wp14:editId="59DBAEAF">
+            <wp:extent cx="5277587" cy="914528"/>
+            <wp:effectExtent l="0" t="0" r="0" b="0"/>
+            <wp:docPr id="230631007" name="Picture 1"/>
+            <wp:cNvGraphicFramePr>
+              <a:graphicFrameLocks xmlns:a="http://schemas.openxmlformats.org/drawingml/2006/main" noChangeAspect="1"/>
+            </wp:cNvGraphicFramePr>
+            <a:graphic xmlns:a="http://schemas.openxmlformats.org/drawingml/2006/main">
+              <a:graphicData uri="http://schemas.openxmlformats.org/drawingml/2006/picture">
+                <pic:pic xmlns:pic="http://schemas.openxmlformats.org/drawingml/2006/picture">
+                  <pic:nvPicPr>
+                    <pic:cNvPr id="230631007" name=""/>
+                    <pic:cNvPicPr/>
+                  </pic:nvPicPr>
+                  <pic:blipFill>
+                    <a:blip r:embed="rId53"/>
+                    <a:stretch>
+                      <a:fillRect/>
+                    </a:stretch>
+                  </pic:blipFill>
+                  <pic:spPr>
+                    <a:xfrm>
+                      <a:off x="0" y="0"/>
+                      <a:ext cx="5277587" cy="914528"/>
+                    </a:xfrm>
+                    <a:prstGeom prst="rect">
+                      <a:avLst/>
+                    </a:prstGeom>
+                  </pic:spPr>
+                </pic:pic>
+              </a:graphicData>
+            </a:graphic>
+          </wp:inline>
+        </w:drawing>
+      </w:r>
+    </w:p>
+    <w:p>
+      <w:pPr>
+        <w:rPr>
+          <w:b/>
+          <w:bCs/>
+        </w:rPr>
+      </w:pPr>
+      <w:r>
+        <w:drawing>
+          <wp:inline distT="0" distB="0" distL="0" distR="0" wp14:anchorId="53AE3D0F" wp14:editId="5E694EA6">
+            <wp:extent cx="3677163" cy="562053"/>
+            <wp:effectExtent l="0" t="0" r="0" b="9525"/>
+            <wp:docPr id="672657137" name="Picture 1"/>
+            <wp:cNvGraphicFramePr>
+              <a:graphicFrameLocks xmlns:a="http://schemas.openxmlformats.org/drawingml/2006/main" noChangeAspect="1"/>
+            </wp:cNvGraphicFramePr>
+            <a:graphic xmlns:a="http://schemas.openxmlformats.org/drawingml/2006/main">
+              <a:graphicData uri="http://schemas.openxmlformats.org/drawingml/2006/picture">
+                <pic:pic xmlns:pic="http://schemas.openxmlformats.org/drawingml/2006/picture">
+                  <pic:nvPicPr>
+                    <pic:cNvPr id="672657137" name=""/>
+                    <pic:cNvPicPr/>
+                  </pic:nvPicPr>
+                  <pic:blipFill>
+                    <a:blip r:embed="rId54"/>
+                    <a:stretch>
+                      <a:fillRect/>
+                    </a:stretch>
+                  </pic:blipFill>
+                  <pic:spPr>
+                    <a:xfrm>
+                      <a:off x="0" y="0"/>
+                      <a:ext cx="3677163" cy="562053"/>
+                    </a:xfrm>
+                    <a:prstGeom prst="rect">
+                      <a:avLst/>
+                    </a:prstGeom>
+                  </pic:spPr>
+                </pic:pic>
+              </a:graphicData>
+            </a:graphic>
+          </wp:inline>
+        </w:drawing>
+      </w:r>
+    </w:p>
+    <w:p>
+      <w:pPr>
+        <w:rPr>
+          <w:b/>
+          <w:bCs/>
+        </w:rPr>
+      </w:pPr>
+      <w:r>
+        <w:rPr>
+          <w:b/>
+          <w:bCs/>
+        </w:rPr>
+        <w:drawing>
+          <wp:inline distT="0" distB="0" distL="0" distR="0" wp14:anchorId="37FEC846" wp14:editId="4455EEEF">
+            <wp:extent cx="5277587" cy="714475"/>
+            <wp:effectExtent l="0" t="0" r="0" b="9525"/>
+            <wp:docPr id="903641382" name="Picture 1"/>
+            <wp:cNvGraphicFramePr>
+              <a:graphicFrameLocks xmlns:a="http://schemas.openxmlformats.org/drawingml/2006/main" noChangeAspect="1"/>
+            </wp:cNvGraphicFramePr>
+            <a:graphic xmlns:a="http://schemas.openxmlformats.org/drawingml/2006/main">
+              <a:graphicData uri="http://schemas.openxmlformats.org/drawingml/2006/picture">
+                <pic:pic xmlns:pic="http://schemas.openxmlformats.org/drawingml/2006/picture">
+                  <pic:nvPicPr>
+                    <pic:cNvPr id="903641382" name=""/>
+                    <pic:cNvPicPr/>
+                  </pic:nvPicPr>
+                  <pic:blipFill>
+                    <a:blip r:embed="rId55"/>
+                    <a:stretch>
+                      <a:fillRect/>
+                    </a:stretch>
+                  </pic:blipFill>
+                  <pic:spPr>
+                    <a:xfrm>
+                      <a:off x="0" y="0"/>
+                      <a:ext cx="5277587" cy="714475"/>
+                    </a:xfrm>
+                    <a:prstGeom prst="rect">
+                      <a:avLst/>
+                    </a:prstGeom>
+                  </pic:spPr>
+                </pic:pic>
+              </a:graphicData>
+            </a:graphic>
+          </wp:inline>
+        </w:drawing>
+      </w:r>
+    </w:p>
+    <w:p>
+      <w:pPr>
+        <w:rPr>
+          <w:b/>
+          <w:bCs/>
+        </w:rPr>
+      </w:pPr>
+      <w:r>
+        <w:rPr>
+          <w:b/>
+          <w:bCs/>
+        </w:rPr>
+        <w:drawing>
+          <wp:inline distT="0" distB="0" distL="0" distR="0" wp14:anchorId="2431546A" wp14:editId="23BA243E">
+            <wp:extent cx="5731510" cy="498475"/>
+            <wp:effectExtent l="0" t="0" r="2540" b="0"/>
+            <wp:docPr id="1404753046" name="Picture 1"/>
+            <wp:cNvGraphicFramePr>
+              <a:graphicFrameLocks xmlns:a="http://schemas.openxmlformats.org/drawingml/2006/main" noChangeAspect="1"/>
+            </wp:cNvGraphicFramePr>
+            <a:graphic xmlns:a="http://schemas.openxmlformats.org/drawingml/2006/main">
+              <a:graphicData uri="http://schemas.openxmlformats.org/drawingml/2006/picture">
+                <pic:pic xmlns:pic="http://schemas.openxmlformats.org/drawingml/2006/picture">
+                  <pic:nvPicPr>
+                    <pic:cNvPr id="1404753046" name=""/>
+                    <pic:cNvPicPr/>
+                  </pic:nvPicPr>
+                  <pic:blipFill>
+                    <a:blip r:embed="rId56"/>
+                    <a:stretch>
+                      <a:fillRect/>
+                    </a:stretch>
+                  </pic:blipFill>
+                  <pic:spPr>
+                    <a:xfrm>
+                      <a:off x="0" y="0"/>
+                      <a:ext cx="5731510" cy="498475"/>
+                    </a:xfrm>
+                    <a:prstGeom prst="rect">
+                      <a:avLst/>
+                    </a:prstGeom>
+                  </pic:spPr>
+                </pic:pic>
+              </a:graphicData>
+            </a:graphic>
+          </wp:inline>
+        </w:drawing>
+      </w:r>
+    </w:p>
+    <w:p>
+      <w:pPr>
+        <w:rPr>
+          <w:b/>
+          <w:bCs/>
+        </w:rPr>
+      </w:pPr>
+      <w:r>
+        <w:rPr>
+          <w:b/>
+          <w:bCs/>
+        </w:rPr>
+        <w:t>Appendix F.</w:t>
+      </w:r>
+      <w:r>
+        <w:rPr>
+          <w:b/>
+          <w:bCs/>
+        </w:rPr>
+        <w:t>9</w:t>
+      </w:r>
+      <w:r>
+        <w:rPr>
+          <w:b/>
+          <w:bCs/>
+        </w:rPr>
+        <w:t xml:space="preserve"> – Parsing performance</w:t>
+      </w:r>
+    </w:p>
+    <w:p>
+      <w:r>
+        <w:drawing>
+          <wp:inline distT="0" distB="0" distL="0" distR="0" wp14:anchorId="0AE82A19" wp14:editId="0674496A">
+            <wp:extent cx="5731510" cy="1401445"/>
+            <wp:effectExtent l="0" t="0" r="2540" b="8255"/>
+            <wp:docPr id="993065539" name="Picture 1"/>
+            <wp:cNvGraphicFramePr>
+              <a:graphicFrameLocks xmlns:a="http://schemas.openxmlformats.org/drawingml/2006/main" noChangeAspect="1"/>
+            </wp:cNvGraphicFramePr>
+            <a:graphic xmlns:a="http://schemas.openxmlformats.org/drawingml/2006/main">
+              <a:graphicData uri="http://schemas.openxmlformats.org/drawingml/2006/picture">
+                <pic:pic xmlns:pic="http://schemas.openxmlformats.org/drawingml/2006/picture">
+                  <pic:nvPicPr>
+                    <pic:cNvPr id="993065539" name=""/>
+                    <pic:cNvPicPr/>
+                  </pic:nvPicPr>
+                  <pic:blipFill>
+                    <a:blip r:embed="rId57"/>
+                    <a:stretch>
+                      <a:fillRect/>
+                    </a:stretch>
+                  </pic:blipFill>
+                  <pic:spPr>
+                    <a:xfrm>
+                      <a:off x="0" y="0"/>
+                      <a:ext cx="5731510" cy="1401445"/>
+                    </a:xfrm>
+                    <a:prstGeom prst="rect">
+                      <a:avLst/>
+                    </a:prstGeom>
+                  </pic:spPr>
+                </pic:pic>
+              </a:graphicData>
+            </a:graphic>
+          </wp:inline>
+        </w:drawing>
+      </w:r>
+    </w:p>
+    <w:p>
+      <w:r>
+        <w:t xml:space="preserve">After the first request (34908 ms), each request afterward happened sequentially, with around 7000ms between them on average (7 seconds). </w:t>
+      </w:r>
+    </w:p>
+    <w:p>
+      <w:pPr>
+        <w:rPr>
+          <w:b/>
+          <w:bCs/>
+        </w:rPr>
+      </w:pPr>
+      <w:r>
+        <w:rPr>
+          <w:b/>
+          <w:bCs/>
+        </w:rPr>
+        <w:t>Appendix F.10 – Data parsed and aggregated correctly</w:t>
+      </w:r>
+    </w:p>
+    <w:p>
+      <w:r>
+        <w:t>Individual statistics sourced from Ballchasing:</w:t>
+      </w:r>
+    </w:p>
+    <w:p>
+      <w:pPr>
+        <w:rPr>
+          <w:b/>
+          <w:bCs/>
+        </w:rPr>
+      </w:pPr>
+      <w:r>
+        <w:rPr>
+          <w:b/>
+          <w:bCs/>
+        </w:rPr>
+        <w:drawing>
+          <wp:inline distT="0" distB="0" distL="0" distR="0" wp14:anchorId="21B8B6AF" wp14:editId="6B462E17">
+            <wp:extent cx="5731510" cy="1397635"/>
+            <wp:effectExtent l="0" t="0" r="2540" b="0"/>
+            <wp:docPr id="2130017640" name="Picture 1"/>
+            <wp:cNvGraphicFramePr>
+              <a:graphicFrameLocks xmlns:a="http://schemas.openxmlformats.org/drawingml/2006/main" noChangeAspect="1"/>
+            </wp:cNvGraphicFramePr>
+            <a:graphic xmlns:a="http://schemas.openxmlformats.org/drawingml/2006/main">
+              <a:graphicData uri="http://schemas.openxmlformats.org/drawingml/2006/picture">
+                <pic:pic xmlns:pic="http://schemas.openxmlformats.org/drawingml/2006/picture">
+                  <pic:nvPicPr>
+                    <pic:cNvPr id="2130017640" name=""/>
+                    <pic:cNvPicPr/>
+                  </pic:nvPicPr>
+                  <pic:blipFill>
+                    <a:blip r:embed="rId58"/>
+                    <a:stretch>
+                      <a:fillRect/>
+                    </a:stretch>
+                  </pic:blipFill>
+                  <pic:spPr>
+                    <a:xfrm>
+                      <a:off x="0" y="0"/>
+                      <a:ext cx="5731510" cy="1397635"/>
+                    </a:xfrm>
+                    <a:prstGeom prst="rect">
+                      <a:avLst/>
+                    </a:prstGeom>
+                  </pic:spPr>
+                </pic:pic>
+              </a:graphicData>
+            </a:graphic>
+          </wp:inline>
+        </w:drawing>
+      </w:r>
+    </w:p>
+    <w:p>
+      <w:pPr>
+        <w:rPr>
+          <w:b/>
+          <w:bCs/>
+        </w:rPr>
+      </w:pPr>
+      <w:r>
+        <w:rPr>
+          <w:b/>
+          <w:bCs/>
+        </w:rPr>
+        <w:lastRenderedPageBreak/>
+        <w:drawing>
+          <wp:inline distT="0" distB="0" distL="0" distR="0" wp14:anchorId="50B81293" wp14:editId="57674BF3">
+            <wp:extent cx="5731510" cy="1381125"/>
+            <wp:effectExtent l="0" t="0" r="2540" b="9525"/>
+            <wp:docPr id="1091255735" name="Picture 1"/>
+            <wp:cNvGraphicFramePr>
+              <a:graphicFrameLocks xmlns:a="http://schemas.openxmlformats.org/drawingml/2006/main" noChangeAspect="1"/>
+            </wp:cNvGraphicFramePr>
+            <a:graphic xmlns:a="http://schemas.openxmlformats.org/drawingml/2006/main">
+              <a:graphicData uri="http://schemas.openxmlformats.org/drawingml/2006/picture">
+                <pic:pic xmlns:pic="http://schemas.openxmlformats.org/drawingml/2006/picture">
+                  <pic:nvPicPr>
+                    <pic:cNvPr id="1091255735" name=""/>
+                    <pic:cNvPicPr/>
+                  </pic:nvPicPr>
+                  <pic:blipFill>
+                    <a:blip r:embed="rId59"/>
+                    <a:stretch>
+                      <a:fillRect/>
+                    </a:stretch>
+                  </pic:blipFill>
+                  <pic:spPr>
+                    <a:xfrm>
+                      <a:off x="0" y="0"/>
+                      <a:ext cx="5731510" cy="1381125"/>
+                    </a:xfrm>
+                    <a:prstGeom prst="rect">
+                      <a:avLst/>
+                    </a:prstGeom>
+                  </pic:spPr>
+                </pic:pic>
+              </a:graphicData>
+            </a:graphic>
+          </wp:inline>
+        </w:drawing>
+      </w:r>
+    </w:p>
+    <w:p>
+      <w:r>
+        <w:t>Data Overview (with KrysJP as target player)</w:t>
+      </w:r>
+    </w:p>
+    <w:p>
+      <w:pPr>
+        <w:rPr>
+          <w:b/>
+          <w:bCs/>
+        </w:rPr>
+      </w:pPr>
+      <w:r>
+        <w:rPr>
+          <w:b/>
+          <w:bCs/>
+        </w:rPr>
+        <w:drawing>
+          <wp:inline distT="0" distB="0" distL="0" distR="0" wp14:anchorId="17950074" wp14:editId="0230D9B7">
+            <wp:extent cx="5731510" cy="3787775"/>
+            <wp:effectExtent l="0" t="0" r="2540" b="3175"/>
+            <wp:docPr id="2030535570" name="Picture 1"/>
+            <wp:cNvGraphicFramePr>
+              <a:graphicFrameLocks xmlns:a="http://schemas.openxmlformats.org/drawingml/2006/main" noChangeAspect="1"/>
+            </wp:cNvGraphicFramePr>
+            <a:graphic xmlns:a="http://schemas.openxmlformats.org/drawingml/2006/main">
+              <a:graphicData uri="http://schemas.openxmlformats.org/drawingml/2006/picture">
+                <pic:pic xmlns:pic="http://schemas.openxmlformats.org/drawingml/2006/picture">
+                  <pic:nvPicPr>
+                    <pic:cNvPr id="2030535570" name=""/>
+                    <pic:cNvPicPr/>
+                  </pic:nvPicPr>
+                  <pic:blipFill>
+                    <a:blip r:embed="rId60"/>
+                    <a:stretch>
+                      <a:fillRect/>
+                    </a:stretch>
+                  </pic:blipFill>
+                  <pic:spPr>
+                    <a:xfrm>
+                      <a:off x="0" y="0"/>
+                      <a:ext cx="5731510" cy="3787775"/>
+                    </a:xfrm>
+                    <a:prstGeom prst="rect">
+                      <a:avLst/>
+                    </a:prstGeom>
+                  </pic:spPr>
+                </pic:pic>
+              </a:graphicData>
+            </a:graphic>
+          </wp:inline>
+        </w:drawing>
+      </w:r>
+    </w:p>
+    <w:p>
+      <w:r>
+        <w:t>Total shots from User: 5+6=11 | Replays: 2 | Result: 11/2 = 5.5 | Correct</w:t>
+      </w:r>
+    </w:p>
+    <w:p>
+      <w:r>
+        <w:t>Total shots from Teammates: 3+2+2+4=11 | Replays: 2 | Teammates: 2 | 11/2/2 = 2.75 | Correct</w:t>
+      </w:r>
+    </w:p>
+    <w:p>
+      <w:r>
+        <w:t>Total shots from Opponents: 7+4+2+2+2=17 | Replays: 2 | Opponents: 3 | 17/2/3 = 2.83 | Correct</w:t>
+      </w:r>
+    </w:p>
+    <w:p>
+      <w:pPr>
+        <w:tabs>
+          <w:tab w:val="left" w:pos="6375"/>
+        </w:tabs>
+        <w:rPr>
+          <w:b/>
+          <w:bCs/>
+        </w:rPr>
+      </w:pPr>
+      <w:r>
+        <w:rPr>
+          <w:b/>
+          <w:bCs/>
+        </w:rPr>
+        <w:t>Appendix F.11 – Playstyle Classification return appropriate result</w:t>
+      </w:r>
+    </w:p>
+    <w:p>
+      <w:pPr>
+        <w:tabs>
+          <w:tab w:val="left" w:pos="6375"/>
+        </w:tabs>
+        <w:rPr>
+          <w:b/>
+          <w:bCs/>
+        </w:rPr>
+      </w:pPr>
+      <w:r>
+        <w:rPr>
+          <w:b/>
+          <w:bCs/>
+        </w:rPr>
+        <w:lastRenderedPageBreak/>
+        <w:drawing>
+          <wp:inline distT="0" distB="0" distL="0" distR="0" wp14:anchorId="70E904F9" wp14:editId="2CF4CFB4">
+            <wp:extent cx="5731510" cy="3184525"/>
+            <wp:effectExtent l="0" t="0" r="2540" b="0"/>
+            <wp:docPr id="1706761559" name="Picture 1"/>
+            <wp:cNvGraphicFramePr>
+              <a:graphicFrameLocks xmlns:a="http://schemas.openxmlformats.org/drawingml/2006/main" noChangeAspect="1"/>
+            </wp:cNvGraphicFramePr>
+            <a:graphic xmlns:a="http://schemas.openxmlformats.org/drawingml/2006/main">
+              <a:graphicData uri="http://schemas.openxmlformats.org/drawingml/2006/picture">
+                <pic:pic xmlns:pic="http://schemas.openxmlformats.org/drawingml/2006/picture">
+                  <pic:nvPicPr>
+                    <pic:cNvPr id="1706761559" name=""/>
+                    <pic:cNvPicPr/>
+                  </pic:nvPicPr>
+                  <pic:blipFill>
+                    <a:blip r:embed="rId61"/>
+                    <a:stretch>
+                      <a:fillRect/>
+                    </a:stretch>
+                  </pic:blipFill>
+                  <pic:spPr>
+                    <a:xfrm>
+                      <a:off x="0" y="0"/>
+                      <a:ext cx="5731510" cy="3184525"/>
+                    </a:xfrm>
+                    <a:prstGeom prst="rect">
+                      <a:avLst/>
+                    </a:prstGeom>
+                  </pic:spPr>
+                </pic:pic>
+              </a:graphicData>
+            </a:graphic>
+          </wp:inline>
+        </w:drawing>
+      </w:r>
+    </w:p>
+    <w:p>
+      <w:pPr>
+        <w:tabs>
+          <w:tab w:val="left" w:pos="6375"/>
+        </w:tabs>
+      </w:pPr>
+      <w:r>
+        <w:t>Defender for Saves /min + Farthest From Ball | Correct</w:t>
+      </w:r>
+    </w:p>
+    <w:p>
+      <w:pPr>
+        <w:tabs>
+          <w:tab w:val="left" w:pos="6375"/>
+        </w:tabs>
+      </w:pPr>
+      <w:r>
+        <w:t>Rank Comparison confirms data correct and in top 20%.</w:t>
+      </w:r>
+    </w:p>
+    <w:p>
+      <w:pPr>
+        <w:tabs>
+          <w:tab w:val="left" w:pos="6375"/>
+        </w:tabs>
+      </w:pPr>
+      <w:r>
+        <w:drawing>
+          <wp:inline distT="0" distB="0" distL="0" distR="0" wp14:anchorId="2CF5CE5D" wp14:editId="6CFA8506">
+            <wp:extent cx="1514686" cy="1286054"/>
+            <wp:effectExtent l="0" t="0" r="9525" b="9525"/>
+            <wp:docPr id="849182302" name="Picture 1"/>
+            <wp:cNvGraphicFramePr>
+              <a:graphicFrameLocks xmlns:a="http://schemas.openxmlformats.org/drawingml/2006/main" noChangeAspect="1"/>
+            </wp:cNvGraphicFramePr>
+            <a:graphic xmlns:a="http://schemas.openxmlformats.org/drawingml/2006/main">
+              <a:graphicData uri="http://schemas.openxmlformats.org/drawingml/2006/picture">
+                <pic:pic xmlns:pic="http://schemas.openxmlformats.org/drawingml/2006/picture">
+                  <pic:nvPicPr>
+                    <pic:cNvPr id="849182302" name=""/>
+                    <pic:cNvPicPr/>
+                  </pic:nvPicPr>
+                  <pic:blipFill>
+                    <a:blip r:embed="rId62"/>
+                    <a:stretch>
+                      <a:fillRect/>
+                    </a:stretch>
+                  </pic:blipFill>
+                  <pic:spPr>
+                    <a:xfrm>
+                      <a:off x="0" y="0"/>
+                      <a:ext cx="1514686" cy="1286054"/>
+                    </a:xfrm>
+                    <a:prstGeom prst="rect">
+                      <a:avLst/>
+                    </a:prstGeom>
+                  </pic:spPr>
+                </pic:pic>
+              </a:graphicData>
+            </a:graphic>
+          </wp:inline>
+        </w:drawing>
+      </w:r>
+      <w:r>
+        <w:rPr>
+          <w:noProof/>
+        </w:rPr>
+        <w:t xml:space="preserve"> </w:t>
+      </w:r>
+      <w:r>
+        <w:drawing>
+          <wp:inline distT="0" distB="0" distL="0" distR="0" wp14:anchorId="7F3A3DF9" wp14:editId="786865F3">
+            <wp:extent cx="2191056" cy="1228896"/>
+            <wp:effectExtent l="0" t="0" r="0" b="0"/>
+            <wp:docPr id="506596296" name="Picture 1"/>
+            <wp:cNvGraphicFramePr>
+              <a:graphicFrameLocks xmlns:a="http://schemas.openxmlformats.org/drawingml/2006/main" noChangeAspect="1"/>
+            </wp:cNvGraphicFramePr>
+            <a:graphic xmlns:a="http://schemas.openxmlformats.org/drawingml/2006/main">
+              <a:graphicData uri="http://schemas.openxmlformats.org/drawingml/2006/picture">
+                <pic:pic xmlns:pic="http://schemas.openxmlformats.org/drawingml/2006/picture">
+                  <pic:nvPicPr>
+                    <pic:cNvPr id="506596296" name=""/>
+                    <pic:cNvPicPr/>
+                  </pic:nvPicPr>
+                  <pic:blipFill>
+                    <a:blip r:embed="rId63"/>
+                    <a:stretch>
+                      <a:fillRect/>
+                    </a:stretch>
+                  </pic:blipFill>
+                  <pic:spPr>
+                    <a:xfrm>
+                      <a:off x="0" y="0"/>
+                      <a:ext cx="2191056" cy="1228896"/>
+                    </a:xfrm>
+                    <a:prstGeom prst="rect">
+                      <a:avLst/>
+                    </a:prstGeom>
+                  </pic:spPr>
+                </pic:pic>
+              </a:graphicData>
+            </a:graphic>
+          </wp:inline>
+        </w:drawing>
+      </w:r>
+    </w:p>
+    <w:p>
+      <w:pPr>
+        <w:rPr>
+          <w:b/>
+          <w:bCs/>
+        </w:rPr>
+      </w:pPr>
+      <w:r>
+        <w:rPr>
+          <w:b/>
+          <w:bCs/>
+        </w:rPr>
+        <w:t>Appendix F.12 – Choosing different ranks in Rank Comparison section</w:t>
+      </w:r>
+    </w:p>
+    <w:p>
+      <w:pPr>
+        <w:rPr>
+          <w:b/>
+          <w:bCs/>
+        </w:rPr>
+      </w:pPr>
+      <w:r>
+        <w:rPr>
+          <w:b/>
+          <w:bCs/>
+        </w:rPr>
+        <w:drawing>
+          <wp:inline distT="0" distB="0" distL="0" distR="0" wp14:anchorId="733DE636" wp14:editId="287DEA5D">
+            <wp:extent cx="5731510" cy="2153920"/>
+            <wp:effectExtent l="0" t="0" r="2540" b="0"/>
+            <wp:docPr id="1574484852" name="Picture 1"/>
+            <wp:cNvGraphicFramePr>
+              <a:graphicFrameLocks xmlns:a="http://schemas.openxmlformats.org/drawingml/2006/main" noChangeAspect="1"/>
+            </wp:cNvGraphicFramePr>
+            <a:graphic xmlns:a="http://schemas.openxmlformats.org/drawingml/2006/main">
+              <a:graphicData uri="http://schemas.openxmlformats.org/drawingml/2006/picture">
+                <pic:pic xmlns:pic="http://schemas.openxmlformats.org/drawingml/2006/picture">
+                  <pic:nvPicPr>
+                    <pic:cNvPr id="1574484852" name=""/>
+                    <pic:cNvPicPr/>
+                  </pic:nvPicPr>
+                  <pic:blipFill>
+                    <a:blip r:embed="rId64"/>
+                    <a:stretch>
+                      <a:fillRect/>
+                    </a:stretch>
+                  </pic:blipFill>
+                  <pic:spPr>
+                    <a:xfrm>
+                      <a:off x="0" y="0"/>
+                      <a:ext cx="5731510" cy="2153920"/>
+                    </a:xfrm>
+                    <a:prstGeom prst="rect">
+                      <a:avLst/>
+                    </a:prstGeom>
+                  </pic:spPr>
+                </pic:pic>
+              </a:graphicData>
+            </a:graphic>
+          </wp:inline>
+        </w:drawing>
+      </w:r>
+    </w:p>
+    <w:p>
+      <w:pPr>
+        <w:rPr>
+          <w:b/>
+          <w:bCs/>
+        </w:rPr>
+      </w:pPr>
+      <w:r>
+        <w:rPr>
+          <w:b/>
+          <w:bCs/>
+        </w:rPr>
+        <w:lastRenderedPageBreak/>
+        <w:drawing>
+          <wp:inline distT="0" distB="0" distL="0" distR="0" wp14:anchorId="24A36AAA" wp14:editId="4200A0FA">
+            <wp:extent cx="5731510" cy="2146300"/>
+            <wp:effectExtent l="0" t="0" r="2540" b="6350"/>
+            <wp:docPr id="677041985" name="Picture 1"/>
+            <wp:cNvGraphicFramePr>
+              <a:graphicFrameLocks xmlns:a="http://schemas.openxmlformats.org/drawingml/2006/main" noChangeAspect="1"/>
+            </wp:cNvGraphicFramePr>
+            <a:graphic xmlns:a="http://schemas.openxmlformats.org/drawingml/2006/main">
+              <a:graphicData uri="http://schemas.openxmlformats.org/drawingml/2006/picture">
+                <pic:pic xmlns:pic="http://schemas.openxmlformats.org/drawingml/2006/picture">
+                  <pic:nvPicPr>
+                    <pic:cNvPr id="677041985" name=""/>
+                    <pic:cNvPicPr/>
+                  </pic:nvPicPr>
+                  <pic:blipFill>
+                    <a:blip r:embed="rId65"/>
+                    <a:stretch>
+                      <a:fillRect/>
+                    </a:stretch>
+                  </pic:blipFill>
+                  <pic:spPr>
+                    <a:xfrm>
+                      <a:off x="0" y="0"/>
+                      <a:ext cx="5731510" cy="2146300"/>
+                    </a:xfrm>
+                    <a:prstGeom prst="rect">
+                      <a:avLst/>
+                    </a:prstGeom>
+                  </pic:spPr>
+                </pic:pic>
+              </a:graphicData>
+            </a:graphic>
+          </wp:inline>
+        </w:drawing>
+      </w:r>
+    </w:p>
+    <w:p>
+      <w:pPr>
+        <w:rPr>
+          <w:b/>
+          <w:bCs/>
+        </w:rPr>
+      </w:pPr>
+      <w:r>
+        <w:rPr>
+          <w:b/>
+          <w:bCs/>
+        </w:rPr>
+        <w:t>Appendix F.13 – Outlier colours appear correctly</w:t>
+      </w:r>
+    </w:p>
+    <w:p>
+      <w:pPr>
+        <w:rPr>
+          <w:b/>
+          <w:bCs/>
+        </w:rPr>
+      </w:pPr>
+      <w:r>
+        <w:rPr>
+          <w:b/>
+          <w:bCs/>
+        </w:rPr>
+        <w:drawing>
+          <wp:inline distT="0" distB="0" distL="0" distR="0" wp14:anchorId="2A375A00" wp14:editId="46545F76">
+            <wp:extent cx="5731510" cy="3592195"/>
+            <wp:effectExtent l="0" t="0" r="2540" b="8255"/>
+            <wp:docPr id="1116051987" name="Picture 1"/>
+            <wp:cNvGraphicFramePr>
+              <a:graphicFrameLocks xmlns:a="http://schemas.openxmlformats.org/drawingml/2006/main" noChangeAspect="1"/>
+            </wp:cNvGraphicFramePr>
+            <a:graphic xmlns:a="http://schemas.openxmlformats.org/drawingml/2006/main">
+              <a:graphicData uri="http://schemas.openxmlformats.org/drawingml/2006/picture">
+                <pic:pic xmlns:pic="http://schemas.openxmlformats.org/drawingml/2006/picture">
+                  <pic:nvPicPr>
+                    <pic:cNvPr id="1116051987" name=""/>
+                    <pic:cNvPicPr/>
+                  </pic:nvPicPr>
+                  <pic:blipFill>
+                    <a:blip r:embed="rId66"/>
+                    <a:stretch>
+                      <a:fillRect/>
+                    </a:stretch>
+                  </pic:blipFill>
+                  <pic:spPr>
+                    <a:xfrm>
+                      <a:off x="0" y="0"/>
+                      <a:ext cx="5731510" cy="3592195"/>
+                    </a:xfrm>
+                    <a:prstGeom prst="rect">
+                      <a:avLst/>
+                    </a:prstGeom>
+                  </pic:spPr>
+                </pic:pic>
+              </a:graphicData>
+            </a:graphic>
+          </wp:inline>
+        </w:drawing>
+      </w:r>
+    </w:p>
+    <w:p>
+      <w:r>
+        <w:drawing>
+          <wp:anchor distT="0" distB="0" distL="114300" distR="114300" simplePos="0" relativeHeight="251658240" behindDoc="0" locked="0" layoutInCell="1" allowOverlap="1" wp14:anchorId="37A9415D" wp14:editId="3ADA4C8A">
+            <wp:simplePos x="0" y="0"/>
+            <wp:positionH relativeFrom="margin">
+              <wp:align>right</wp:align>
+            </wp:positionH>
+            <wp:positionV relativeFrom="paragraph">
+              <wp:posOffset>8255</wp:posOffset>
+            </wp:positionV>
+            <wp:extent cx="1695687" cy="581106"/>
+            <wp:effectExtent l="0" t="0" r="0" b="9525"/>
+            <wp:wrapSquare wrapText="bothSides"/>
+            <wp:docPr id="1240204017" name="Picture 1"/>
+            <wp:cNvGraphicFramePr>
+              <a:graphicFrameLocks xmlns:a="http://schemas.openxmlformats.org/drawingml/2006/main" noChangeAspect="1"/>
+            </wp:cNvGraphicFramePr>
+            <a:graphic xmlns:a="http://schemas.openxmlformats.org/drawingml/2006/main">
+              <a:graphicData uri="http://schemas.openxmlformats.org/drawingml/2006/picture">
+                <pic:pic xmlns:pic="http://schemas.openxmlformats.org/drawingml/2006/picture">
+                  <pic:nvPicPr>
+                    <pic:cNvPr id="1240204017" name=""/>
+                    <pic:cNvPicPr/>
+                  </pic:nvPicPr>
+                  <pic:blipFill>
+                    <a:blip r:embed="rId67">
+                      <a:extLst>
+                        <a:ext uri="{28A0092B-C50C-407E-A947-70E740481C1C}">
+                          <a14:useLocalDpi xmlns:a14="http://schemas.microsoft.com/office/drawing/2010/main" val="0"/>
+                        </a:ext>
+                      </a:extLst>
+                    </a:blip>
+                    <a:stretch>
+                      <a:fillRect/>
+                    </a:stretch>
+                  </pic:blipFill>
+                  <pic:spPr>
+                    <a:xfrm>
+                      <a:off x="0" y="0"/>
+                      <a:ext cx="1695687" cy="581106"/>
+                    </a:xfrm>
+                    <a:prstGeom prst="rect">
+                      <a:avLst/>
+                    </a:prstGeom>
+                  </pic:spPr>
+                </pic:pic>
+              </a:graphicData>
+            </a:graphic>
+          </wp:anchor>
+        </w:drawing>
+      </w:r>
+      <w:r>
+        <w:t>Clearly high/low values are highlighted as intended.</w:t>
+      </w:r>
+    </w:p>
+    <w:p>
+      <w:pPr>
+        <w:rPr>
+          <w:b/>
+          <w:bCs/>
+        </w:rPr>
+      </w:pPr>
+    </w:p>
+    <w:p>
+      <w:pPr>
+        <w:rPr>
+          <w:b/>
+          <w:bCs/>
+        </w:rPr>
+      </w:pPr>
+      <w:r>
+        <w:rPr>
+          <w:b/>
+          <w:bCs/>
+        </w:rPr>
+        <w:t>Appendix F.14 – Parser difference</w:t>
+      </w:r>
+    </w:p>
+    <w:p>
+      <w:r>
+        <w:t>Same values for core:</w:t>
+      </w:r>
+    </w:p>
+    <w:p>
+      <w:pPr>
+        <w:rPr>
+          <w:noProof/>
+        </w:rPr>
+      </w:pPr>
+      <w:r>
+        <w:lastRenderedPageBreak/>
+        <w:drawing>
+          <wp:inline distT="0" distB="0" distL="0" distR="0" wp14:anchorId="4D641C59" wp14:editId="679B81EC">
+            <wp:extent cx="2835105" cy="2114550"/>
+            <wp:effectExtent l="0" t="0" r="3810" b="0"/>
+            <wp:docPr id="395189645" name="Picture 1"/>
+            <wp:cNvGraphicFramePr>
+              <a:graphicFrameLocks xmlns:a="http://schemas.openxmlformats.org/drawingml/2006/main" noChangeAspect="1"/>
+            </wp:cNvGraphicFramePr>
+            <a:graphic xmlns:a="http://schemas.openxmlformats.org/drawingml/2006/main">
+              <a:graphicData uri="http://schemas.openxmlformats.org/drawingml/2006/picture">
+                <pic:pic xmlns:pic="http://schemas.openxmlformats.org/drawingml/2006/picture">
+                  <pic:nvPicPr>
+                    <pic:cNvPr id="395189645" name=""/>
+                    <pic:cNvPicPr/>
+                  </pic:nvPicPr>
+                  <pic:blipFill>
+                    <a:blip r:embed="rId68"/>
+                    <a:stretch>
+                      <a:fillRect/>
+                    </a:stretch>
+                  </pic:blipFill>
+                  <pic:spPr>
+                    <a:xfrm>
+                      <a:off x="0" y="0"/>
+                      <a:ext cx="2853473" cy="2128250"/>
+                    </a:xfrm>
+                    <a:prstGeom prst="rect">
+                      <a:avLst/>
+                    </a:prstGeom>
+                  </pic:spPr>
+                </pic:pic>
+              </a:graphicData>
+            </a:graphic>
+          </wp:inline>
+        </w:drawing>
+      </w:r>
+      <w:r>
+        <w:rPr>
+          <w:noProof/>
+        </w:rPr>
+        <w:t xml:space="preserve"> </w:t>
+      </w:r>
+      <w:r>
+        <w:drawing>
+          <wp:inline distT="0" distB="0" distL="0" distR="0" wp14:anchorId="6F7FD46C" wp14:editId="54750DF7">
+            <wp:extent cx="2834640" cy="2103526"/>
+            <wp:effectExtent l="0" t="0" r="3810" b="0"/>
+            <wp:docPr id="1398499512" name="Picture 1"/>
+            <wp:cNvGraphicFramePr>
+              <a:graphicFrameLocks xmlns:a="http://schemas.openxmlformats.org/drawingml/2006/main" noChangeAspect="1"/>
+            </wp:cNvGraphicFramePr>
+            <a:graphic xmlns:a="http://schemas.openxmlformats.org/drawingml/2006/main">
+              <a:graphicData uri="http://schemas.openxmlformats.org/drawingml/2006/picture">
+                <pic:pic xmlns:pic="http://schemas.openxmlformats.org/drawingml/2006/picture">
+                  <pic:nvPicPr>
+                    <pic:cNvPr id="1398499512" name=""/>
+                    <pic:cNvPicPr/>
+                  </pic:nvPicPr>
+                  <pic:blipFill>
+                    <a:blip r:embed="rId69"/>
+                    <a:stretch>
+                      <a:fillRect/>
+                    </a:stretch>
+                  </pic:blipFill>
+                  <pic:spPr>
+                    <a:xfrm>
+                      <a:off x="0" y="0"/>
+                      <a:ext cx="2841097" cy="2108318"/>
+                    </a:xfrm>
+                    <a:prstGeom prst="rect">
+                      <a:avLst/>
+                    </a:prstGeom>
+                  </pic:spPr>
+                </pic:pic>
+              </a:graphicData>
+            </a:graphic>
+          </wp:inline>
+        </w:drawing>
+      </w:r>
+    </w:p>
+    <w:p>
+      <w:pPr>
+        <w:rPr>
+          <w:noProof/>
+        </w:rPr>
+      </w:pPr>
+      <w:r>
+        <w:rPr>
+          <w:noProof/>
+        </w:rPr>
+        <w:t>Largest difference is boost category:</w:t>
+      </w:r>
+    </w:p>
+    <w:p>
+      <w:r>
+        <w:drawing>
+          <wp:inline distT="0" distB="0" distL="0" distR="0" wp14:anchorId="479FE242" wp14:editId="5AFE1085">
+            <wp:extent cx="2675937" cy="1780894"/>
+            <wp:effectExtent l="0" t="0" r="0" b="0"/>
+            <wp:docPr id="1434641918" name="Picture 1"/>
+            <wp:cNvGraphicFramePr>
+              <a:graphicFrameLocks xmlns:a="http://schemas.openxmlformats.org/drawingml/2006/main" noChangeAspect="1"/>
+            </wp:cNvGraphicFramePr>
+            <a:graphic xmlns:a="http://schemas.openxmlformats.org/drawingml/2006/main">
+              <a:graphicData uri="http://schemas.openxmlformats.org/drawingml/2006/picture">
+                <pic:pic xmlns:pic="http://schemas.openxmlformats.org/drawingml/2006/picture">
+                  <pic:nvPicPr>
+                    <pic:cNvPr id="1434641918" name=""/>
+                    <pic:cNvPicPr/>
+                  </pic:nvPicPr>
+                  <pic:blipFill>
+                    <a:blip r:embed="rId70"/>
+                    <a:stretch>
+                      <a:fillRect/>
+                    </a:stretch>
+                  </pic:blipFill>
+                  <pic:spPr>
+                    <a:xfrm>
+                      <a:off x="0" y="0"/>
+                      <a:ext cx="2691088" cy="1790977"/>
+                    </a:xfrm>
+                    <a:prstGeom prst="rect">
+                      <a:avLst/>
+                    </a:prstGeom>
+                  </pic:spPr>
+                </pic:pic>
+              </a:graphicData>
+            </a:graphic>
+          </wp:inline>
+        </w:drawing>
+      </w:r>
+      <w:r>
+        <w:rPr>
+          <w:noProof/>
+        </w:rPr>
+        <w:t xml:space="preserve"> </w:t>
+      </w:r>
+      <w:r>
+        <w:drawing>
+          <wp:inline distT="0" distB="0" distL="0" distR="0" wp14:anchorId="30D82FB1" wp14:editId="36FE912C">
+            <wp:extent cx="2847975" cy="1752139"/>
+            <wp:effectExtent l="0" t="0" r="0" b="635"/>
+            <wp:docPr id="1907660900" name="Picture 1"/>
+            <wp:cNvGraphicFramePr>
+              <a:graphicFrameLocks xmlns:a="http://schemas.openxmlformats.org/drawingml/2006/main" noChangeAspect="1"/>
+            </wp:cNvGraphicFramePr>
+            <a:graphic xmlns:a="http://schemas.openxmlformats.org/drawingml/2006/main">
+              <a:graphicData uri="http://schemas.openxmlformats.org/drawingml/2006/picture">
+                <pic:pic xmlns:pic="http://schemas.openxmlformats.org/drawingml/2006/picture">
+                  <pic:nvPicPr>
+                    <pic:cNvPr id="1907660900" name=""/>
+                    <pic:cNvPicPr/>
+                  </pic:nvPicPr>
+                  <pic:blipFill>
+                    <a:blip r:embed="rId71"/>
+                    <a:stretch>
+                      <a:fillRect/>
+                    </a:stretch>
+                  </pic:blipFill>
+                  <pic:spPr>
+                    <a:xfrm>
+                      <a:off x="0" y="0"/>
+                      <a:ext cx="2872188" cy="1767035"/>
+                    </a:xfrm>
+                    <a:prstGeom prst="rect">
+                      <a:avLst/>
+                    </a:prstGeom>
+                  </pic:spPr>
+                </pic:pic>
+              </a:graphicData>
+            </a:graphic>
+          </wp:inline>
+        </w:drawing>
+      </w:r>
+    </w:p>
+    <w:p>
+      <w:r>
+        <w:t>Same playstyle result, but different confidence:</w:t>
+      </w:r>
+    </w:p>
+    <w:p>
+      <w:r>
+        <w:drawing>
+          <wp:inline distT="0" distB="0" distL="0" distR="0" wp14:anchorId="198D202E" wp14:editId="151512E7">
+            <wp:extent cx="2400300" cy="1329397"/>
+            <wp:effectExtent l="0" t="0" r="0" b="4445"/>
+            <wp:docPr id="215415043" name="Picture 1"/>
+            <wp:cNvGraphicFramePr>
+              <a:graphicFrameLocks xmlns:a="http://schemas.openxmlformats.org/drawingml/2006/main" noChangeAspect="1"/>
+            </wp:cNvGraphicFramePr>
+            <a:graphic xmlns:a="http://schemas.openxmlformats.org/drawingml/2006/main">
+              <a:graphicData uri="http://schemas.openxmlformats.org/drawingml/2006/picture">
+                <pic:pic xmlns:pic="http://schemas.openxmlformats.org/drawingml/2006/picture">
+                  <pic:nvPicPr>
+                    <pic:cNvPr id="215415043" name=""/>
+                    <pic:cNvPicPr/>
+                  </pic:nvPicPr>
+                  <pic:blipFill>
+                    <a:blip r:embed="rId72"/>
+                    <a:stretch>
+                      <a:fillRect/>
+                    </a:stretch>
+                  </pic:blipFill>
+                  <pic:spPr>
+                    <a:xfrm>
+                      <a:off x="0" y="0"/>
+                      <a:ext cx="2406316" cy="1332729"/>
+                    </a:xfrm>
+                    <a:prstGeom prst="rect">
+                      <a:avLst/>
+                    </a:prstGeom>
+                  </pic:spPr>
+                </pic:pic>
+              </a:graphicData>
+            </a:graphic>
+          </wp:inline>
+        </w:drawing>
+      </w:r>
+      <w:r>
+        <w:rPr>
+          <w:noProof/>
+        </w:rPr>
+        <w:t xml:space="preserve"> </w:t>
+      </w:r>
+      <w:r>
+        <w:drawing>
+          <wp:inline distT="0" distB="0" distL="0" distR="0" wp14:anchorId="6D828192" wp14:editId="6473AE91">
+            <wp:extent cx="2439149" cy="1352550"/>
+            <wp:effectExtent l="0" t="0" r="0" b="0"/>
+            <wp:docPr id="1229236012" name="Picture 1"/>
+            <wp:cNvGraphicFramePr>
+              <a:graphicFrameLocks xmlns:a="http://schemas.openxmlformats.org/drawingml/2006/main" noChangeAspect="1"/>
+            </wp:cNvGraphicFramePr>
+            <a:graphic xmlns:a="http://schemas.openxmlformats.org/drawingml/2006/main">
+              <a:graphicData uri="http://schemas.openxmlformats.org/drawingml/2006/picture">
+                <pic:pic xmlns:pic="http://schemas.openxmlformats.org/drawingml/2006/picture">
+                  <pic:nvPicPr>
+                    <pic:cNvPr id="1229236012" name=""/>
+                    <pic:cNvPicPr/>
+                  </pic:nvPicPr>
+                  <pic:blipFill>
+                    <a:blip r:embed="rId73"/>
+                    <a:stretch>
+                      <a:fillRect/>
+                    </a:stretch>
+                  </pic:blipFill>
+                  <pic:spPr>
+                    <a:xfrm>
+                      <a:off x="0" y="0"/>
+                      <a:ext cx="2445317" cy="1355970"/>
+                    </a:xfrm>
+                    <a:prstGeom prst="rect">
+                      <a:avLst/>
+                    </a:prstGeom>
+                  </pic:spPr>
+                </pic:pic>
+              </a:graphicData>
+            </a:graphic>
+          </wp:inline>
+        </w:drawing>
+      </w:r>
+    </w:p>
+    <w:p>
+      <w:pPr>
+        <w:rPr>
+          <w:b/>
+          <w:bCs/>
+        </w:rPr>
+      </w:pPr>
     </w:p>
     <w:sectPr>
       <w:pgSz w:w="11906" w:h="16838"/>

</xml_diff>

<commit_message>
added end-user tests and model evaluation to report
</commit_message>
<xml_diff>
--- a/Appendix.docx
+++ b/Appendix.docx
@@ -368,23 +368,7 @@
           <w:sz w:val="20"/>
           <w:szCs w:val="20"/>
         </w:rPr>
-        <w:t xml:space="preserve">PASSIVE: Will usually get beat to the ball because </w:t>
-      </w:r>
-      <w:proofErr w:type="spellStart"/>
-      <w:r>
-        <w:rPr>
-          <w:sz w:val="20"/>
-          <w:szCs w:val="20"/>
-        </w:rPr>
-        <w:t>theyre</w:t>
-      </w:r>
-      <w:proofErr w:type="spellEnd"/>
-      <w:r>
-        <w:rPr>
-          <w:sz w:val="20"/>
-          <w:szCs w:val="20"/>
-        </w:rPr>
-        <w:t xml:space="preserve"> not quick enough, also may struggle offensively to get goals,</w:t>
+        <w:t>PASSIVE: Will usually get beat to the ball because theyre not quick enough, also may struggle offensively to get goals,</w:t>
       </w:r>
     </w:p>
     <w:p>
@@ -524,23 +508,7 @@
           <w:sz w:val="20"/>
           <w:szCs w:val="20"/>
         </w:rPr>
-        <w:t xml:space="preserve">It certainly has! The website made me realise I wasn’t actually using </w:t>
-      </w:r>
-      <w:proofErr w:type="spellStart"/>
-      <w:r>
-        <w:rPr>
-          <w:sz w:val="20"/>
-          <w:szCs w:val="20"/>
-        </w:rPr>
-        <w:t>powerslide</w:t>
-      </w:r>
-      <w:proofErr w:type="spellEnd"/>
-      <w:r>
-        <w:rPr>
-          <w:sz w:val="20"/>
-          <w:szCs w:val="20"/>
-        </w:rPr>
-        <w:t>, and that discovery really improved my movement by quite a bit.</w:t>
+        <w:t>It certainly has! The website made me realise I wasn’t actually using powerslide, and that discovery really improved my movement by quite a bit.</w:t>
       </w:r>
     </w:p>
     <w:p>
@@ -664,23 +632,7 @@
           <w:sz w:val="20"/>
           <w:szCs w:val="20"/>
         </w:rPr>
-        <w:t xml:space="preserve">Decoy: A skilled player who misses the ball </w:t>
-      </w:r>
-      <w:proofErr w:type="gramStart"/>
-      <w:r>
-        <w:rPr>
-          <w:sz w:val="20"/>
-          <w:szCs w:val="20"/>
-        </w:rPr>
-        <w:t>completely, yet</w:t>
-      </w:r>
-      <w:proofErr w:type="gramEnd"/>
-      <w:r>
-        <w:rPr>
-          <w:sz w:val="20"/>
-          <w:szCs w:val="20"/>
-        </w:rPr>
-        <w:t xml:space="preserve"> manages to confuse everyone in the process.</w:t>
+        <w:t>Decoy: A skilled player who misses the ball completely, yet manages to confuse everyone in the process.</w:t>
       </w:r>
     </w:p>
     <w:p>
@@ -789,23 +741,7 @@
           <w:sz w:val="20"/>
           <w:szCs w:val="20"/>
         </w:rPr>
-        <w:t xml:space="preserve">I’d advise bronzes to turn on ball cam (click triangle / Y on Xbox) and practice </w:t>
-      </w:r>
-      <w:proofErr w:type="spellStart"/>
-      <w:r>
-        <w:rPr>
-          <w:sz w:val="20"/>
-          <w:szCs w:val="20"/>
-        </w:rPr>
-        <w:t>powerslides</w:t>
-      </w:r>
-      <w:proofErr w:type="spellEnd"/>
-      <w:r>
-        <w:rPr>
-          <w:sz w:val="20"/>
-          <w:szCs w:val="20"/>
-        </w:rPr>
-        <w:t xml:space="preserve"> (click square / X on Xbox)</w:t>
+        <w:t>I’d advise bronzes to turn on ball cam (click triangle / Y on Xbox) and practice powerslides (click square / X on Xbox)</w:t>
       </w:r>
     </w:p>
     <w:p>
@@ -884,39 +820,7 @@
           <w:sz w:val="20"/>
           <w:szCs w:val="20"/>
         </w:rPr>
-        <w:t xml:space="preserve">An overall data overview may be useful for all levels of players, considering Finn is the highest rank, while Jake is a middle rank. The sort of data included in the overview can be similar as ballchasing.com, such as boost metrics to help with boost management and other general statistics, things like the lack of </w:t>
-      </w:r>
-      <w:proofErr w:type="spellStart"/>
-      <w:r>
-        <w:rPr>
-          <w:sz w:val="20"/>
-          <w:szCs w:val="20"/>
-        </w:rPr>
-        <w:t>powerslide</w:t>
-      </w:r>
-      <w:proofErr w:type="spellEnd"/>
-      <w:r>
-        <w:rPr>
-          <w:sz w:val="20"/>
-          <w:szCs w:val="20"/>
-        </w:rPr>
-        <w:t xml:space="preserve"> use should be covered in the data comparison section of my project, where Jake’s lack of </w:t>
-      </w:r>
-      <w:proofErr w:type="spellStart"/>
-      <w:r>
-        <w:rPr>
-          <w:sz w:val="20"/>
-          <w:szCs w:val="20"/>
-        </w:rPr>
-        <w:t>powerslide</w:t>
-      </w:r>
-      <w:proofErr w:type="spellEnd"/>
-      <w:r>
-        <w:rPr>
-          <w:sz w:val="20"/>
-          <w:szCs w:val="20"/>
-        </w:rPr>
-        <w:t xml:space="preserve"> would be highlighted.</w:t>
+        <w:t>An overall data overview may be useful for all levels of players, considering Finn is the highest rank, while Jake is a middle rank. The sort of data included in the overview can be similar as ballchasing.com, such as boost metrics to help with boost management and other general statistics, things like the lack of powerslide use should be covered in the data comparison section of my project, where Jake’s lack of powerslide would be highlighted.</w:t>
       </w:r>
     </w:p>
     <w:p>
@@ -1035,167 +939,7 @@
           <w:sz w:val="20"/>
           <w:szCs w:val="20"/>
         </w:rPr>
-        <w:t xml:space="preserve">yes, although not as much with the 10 </w:t>
-      </w:r>
-      <w:proofErr w:type="gramStart"/>
-      <w:r>
-        <w:rPr>
-          <w:sz w:val="20"/>
-          <w:szCs w:val="20"/>
-        </w:rPr>
-        <w:t>replay</w:t>
-      </w:r>
-      <w:proofErr w:type="gramEnd"/>
-      <w:r>
-        <w:rPr>
-          <w:sz w:val="20"/>
-          <w:szCs w:val="20"/>
-        </w:rPr>
-        <w:t xml:space="preserve"> </w:t>
-      </w:r>
-      <w:proofErr w:type="gramStart"/>
-      <w:r>
-        <w:rPr>
-          <w:sz w:val="20"/>
-          <w:szCs w:val="20"/>
-        </w:rPr>
-        <w:t>limit</w:t>
-      </w:r>
-      <w:proofErr w:type="gramEnd"/>
-      <w:r>
-        <w:rPr>
-          <w:sz w:val="20"/>
-          <w:szCs w:val="20"/>
-        </w:rPr>
-        <w:t xml:space="preserve"> they added. I have tried to although only once or twice. Not sure if it counts but getting replays from when you were at your peak and watching them back in </w:t>
-      </w:r>
-      <w:proofErr w:type="spellStart"/>
-      <w:r>
-        <w:rPr>
-          <w:sz w:val="20"/>
-          <w:szCs w:val="20"/>
-        </w:rPr>
-        <w:t>rl</w:t>
-      </w:r>
-      <w:proofErr w:type="spellEnd"/>
-      <w:r>
-        <w:rPr>
-          <w:sz w:val="20"/>
-          <w:szCs w:val="20"/>
-        </w:rPr>
-        <w:t xml:space="preserve"> is helpful. In terms of on the </w:t>
-      </w:r>
-      <w:proofErr w:type="gramStart"/>
-      <w:r>
-        <w:rPr>
-          <w:sz w:val="20"/>
-          <w:szCs w:val="20"/>
-        </w:rPr>
-        <w:t>website</w:t>
-      </w:r>
-      <w:proofErr w:type="gramEnd"/>
-      <w:r>
-        <w:rPr>
-          <w:sz w:val="20"/>
-          <w:szCs w:val="20"/>
-        </w:rPr>
-        <w:t xml:space="preserve"> it was mostly looking at boost usage, positioning, time in air, average speed, basically all the stats that it summarises and comparing them to everyone else on the pitch. To see if there are trends in my gameplay, </w:t>
-      </w:r>
-      <w:proofErr w:type="spellStart"/>
-      <w:r>
-        <w:rPr>
-          <w:sz w:val="20"/>
-          <w:szCs w:val="20"/>
-        </w:rPr>
-        <w:t>e.g</w:t>
-      </w:r>
-      <w:proofErr w:type="spellEnd"/>
-      <w:r>
-        <w:rPr>
-          <w:sz w:val="20"/>
-          <w:szCs w:val="20"/>
-        </w:rPr>
-        <w:t xml:space="preserve"> super grounded (which </w:t>
-      </w:r>
-      <w:proofErr w:type="spellStart"/>
-      <w:r>
-        <w:rPr>
-          <w:sz w:val="20"/>
-          <w:szCs w:val="20"/>
-        </w:rPr>
-        <w:t>i</w:t>
-      </w:r>
-      <w:proofErr w:type="spellEnd"/>
-      <w:r>
-        <w:rPr>
-          <w:sz w:val="20"/>
-          <w:szCs w:val="20"/>
-        </w:rPr>
-        <w:t xml:space="preserve"> used to be when </w:t>
-      </w:r>
-      <w:proofErr w:type="spellStart"/>
-      <w:r>
-        <w:rPr>
-          <w:sz w:val="20"/>
-          <w:szCs w:val="20"/>
-        </w:rPr>
-        <w:t>i</w:t>
-      </w:r>
-      <w:proofErr w:type="spellEnd"/>
-      <w:r>
-        <w:rPr>
-          <w:sz w:val="20"/>
-          <w:szCs w:val="20"/>
-        </w:rPr>
-        <w:t xml:space="preserve"> used it a 1/2 years back) to get an idea of what </w:t>
-      </w:r>
-      <w:proofErr w:type="spellStart"/>
-      <w:r>
-        <w:rPr>
-          <w:sz w:val="20"/>
-          <w:szCs w:val="20"/>
-        </w:rPr>
-        <w:t>i'm</w:t>
-      </w:r>
-      <w:proofErr w:type="spellEnd"/>
-      <w:r>
-        <w:rPr>
-          <w:sz w:val="20"/>
-          <w:szCs w:val="20"/>
-        </w:rPr>
-        <w:t xml:space="preserve"> doing differently. Other than </w:t>
-      </w:r>
-      <w:proofErr w:type="gramStart"/>
-      <w:r>
-        <w:rPr>
-          <w:sz w:val="20"/>
-          <w:szCs w:val="20"/>
-        </w:rPr>
-        <w:t>that</w:t>
-      </w:r>
-      <w:proofErr w:type="gramEnd"/>
-      <w:r>
-        <w:rPr>
-          <w:sz w:val="20"/>
-          <w:szCs w:val="20"/>
-        </w:rPr>
-        <w:t xml:space="preserve"> </w:t>
-      </w:r>
-      <w:proofErr w:type="spellStart"/>
-      <w:r>
-        <w:rPr>
-          <w:sz w:val="20"/>
-          <w:szCs w:val="20"/>
-        </w:rPr>
-        <w:t>i</w:t>
-      </w:r>
-      <w:proofErr w:type="spellEnd"/>
-      <w:r>
-        <w:rPr>
-          <w:sz w:val="20"/>
-          <w:szCs w:val="20"/>
-        </w:rPr>
-        <w:t xml:space="preserve"> don't think theres anything else you can really use ballchasing for</w:t>
+        <w:t>yes, although not as much with the 10 replay limit they added. I have tried to although only once or twice. Not sure if it counts but getting replays from when you were at your peak and watching them back in rl is helpful. In terms of on the website it was mostly looking at boost usage, positioning, time in air, average speed, basically all the stats that it summarises and comparing them to everyone else on the pitch. To see if there are trends in my gameplay, e.g super grounded (which i used to be when i used it a 1/2 years back) to get an idea of what i'm doing differently. Other than that i don't think theres anything else you can really use ballchasing for</w:t>
       </w:r>
     </w:p>
     <w:p>
@@ -1215,103 +959,7 @@
           <w:sz w:val="20"/>
           <w:szCs w:val="20"/>
         </w:rPr>
-        <w:t xml:space="preserve">one thing that mostly </w:t>
-      </w:r>
-      <w:proofErr w:type="spellStart"/>
-      <w:r>
-        <w:rPr>
-          <w:sz w:val="20"/>
-          <w:szCs w:val="20"/>
-        </w:rPr>
-        <w:t>i'm</w:t>
-      </w:r>
-      <w:proofErr w:type="spellEnd"/>
-      <w:r>
-        <w:rPr>
-          <w:sz w:val="20"/>
-          <w:szCs w:val="20"/>
-        </w:rPr>
-        <w:t xml:space="preserve"> interested to see is there's a </w:t>
-      </w:r>
-      <w:proofErr w:type="spellStart"/>
-      <w:r>
-        <w:rPr>
-          <w:sz w:val="20"/>
-          <w:szCs w:val="20"/>
-        </w:rPr>
-        <w:t>johhnyboi</w:t>
-      </w:r>
-      <w:proofErr w:type="spellEnd"/>
-      <w:r>
-        <w:rPr>
-          <w:sz w:val="20"/>
-          <w:szCs w:val="20"/>
-        </w:rPr>
-        <w:t xml:space="preserve"> video a while back about % behind ball and </w:t>
-      </w:r>
-      <w:proofErr w:type="gramStart"/>
-      <w:r>
-        <w:rPr>
-          <w:sz w:val="20"/>
-          <w:szCs w:val="20"/>
-        </w:rPr>
-        <w:t>basically</w:t>
-      </w:r>
-      <w:proofErr w:type="gramEnd"/>
-      <w:r>
-        <w:rPr>
-          <w:sz w:val="20"/>
-          <w:szCs w:val="20"/>
-        </w:rPr>
-        <w:t xml:space="preserve"> he believed in 3s that had a significant correlation to winning. Would love to see that summarised to see if there is an actual correlation between the 2. More broadly, analysis of multiple games at once or even your whole library of games would be amazing to improve as you can 100% see your playstyle over many games and days which means you can be confident in the things you need to improve. This would be difficult </w:t>
-      </w:r>
-      <w:proofErr w:type="spellStart"/>
-      <w:r>
-        <w:rPr>
-          <w:sz w:val="20"/>
-          <w:szCs w:val="20"/>
-        </w:rPr>
-        <w:t>i</w:t>
-      </w:r>
-      <w:proofErr w:type="spellEnd"/>
-      <w:r>
-        <w:rPr>
-          <w:sz w:val="20"/>
-          <w:szCs w:val="20"/>
-        </w:rPr>
-        <w:t xml:space="preserve"> imagine but comparison to an average player at that rank/</w:t>
-      </w:r>
-      <w:proofErr w:type="spellStart"/>
-      <w:r>
-        <w:rPr>
-          <w:sz w:val="20"/>
-          <w:szCs w:val="20"/>
-        </w:rPr>
-        <w:t>mmr</w:t>
-      </w:r>
-      <w:proofErr w:type="spellEnd"/>
-      <w:r>
-        <w:rPr>
-          <w:sz w:val="20"/>
-          <w:szCs w:val="20"/>
-        </w:rPr>
-        <w:t xml:space="preserve"> in all the stats would be super helpful, like in a spider diagram so you can see </w:t>
-      </w:r>
-      <w:proofErr w:type="spellStart"/>
-      <w:r>
-        <w:rPr>
-          <w:sz w:val="20"/>
-          <w:szCs w:val="20"/>
-        </w:rPr>
-        <w:t>ur</w:t>
-      </w:r>
-      <w:proofErr w:type="spellEnd"/>
-      <w:r>
-        <w:rPr>
-          <w:sz w:val="20"/>
-          <w:szCs w:val="20"/>
-        </w:rPr>
-        <w:t xml:space="preserve"> speed is bad but your time behind ball is good, etc.,</w:t>
+        <w:t>one thing that mostly i'm interested to see is there's a johhnyboi video a while back about % behind ball and basically he believed in 3s that had a significant correlation to winning. Would love to see that summarised to see if there is an actual correlation between the 2. More broadly, analysis of multiple games at once or even your whole library of games would be amazing to improve as you can 100% see your playstyle over many games and days which means you can be confident in the things you need to improve. This would be difficult i imagine but comparison to an average player at that rank/mmr in all the stats would be super helpful, like in a spider diagram so you can see ur speed is bad but your time behind ball is good, etc.,</w:t>
       </w:r>
     </w:p>
     <w:p>
@@ -1331,55 +979,23 @@
           <w:sz w:val="20"/>
           <w:szCs w:val="20"/>
         </w:rPr>
-        <w:t xml:space="preserve">a) </w:t>
-      </w:r>
-      <w:proofErr w:type="spellStart"/>
-      <w:r>
-        <w:rPr>
-          <w:sz w:val="20"/>
-          <w:szCs w:val="20"/>
-        </w:rPr>
-        <w:t>redicter</w:t>
-      </w:r>
-      <w:proofErr w:type="spellEnd"/>
-      <w:r>
-        <w:rPr>
-          <w:sz w:val="20"/>
-          <w:szCs w:val="20"/>
-        </w:rPr>
-        <w:t xml:space="preserve">/striker= someone always ahead of ball. hard to differentiate with bump heavy playstyles though. </w:t>
-      </w:r>
-    </w:p>
-    <w:p>
-      <w:pPr>
-        <w:pStyle w:val="ListParagraph"/>
-        <w:rPr>
-          <w:sz w:val="20"/>
-          <w:szCs w:val="20"/>
-        </w:rPr>
-      </w:pPr>
-      <w:r>
-        <w:rPr>
-          <w:sz w:val="20"/>
-          <w:szCs w:val="20"/>
-        </w:rPr>
-        <w:t>b) Bumper/</w:t>
-      </w:r>
-      <w:proofErr w:type="spellStart"/>
-      <w:r>
-        <w:rPr>
-          <w:sz w:val="20"/>
-          <w:szCs w:val="20"/>
-        </w:rPr>
-        <w:t>demoer</w:t>
-      </w:r>
-      <w:proofErr w:type="spellEnd"/>
-      <w:r>
-        <w:rPr>
-          <w:sz w:val="20"/>
-          <w:szCs w:val="20"/>
-        </w:rPr>
-        <w:t xml:space="preserve">= ahead of ball + demos/bumps. </w:t>
+        <w:t xml:space="preserve">a) redicter/striker= someone always ahead of ball. hard to differentiate with bump heavy playstyles though. </w:t>
+      </w:r>
+    </w:p>
+    <w:p>
+      <w:pPr>
+        <w:pStyle w:val="ListParagraph"/>
+        <w:rPr>
+          <w:sz w:val="20"/>
+          <w:szCs w:val="20"/>
+        </w:rPr>
+      </w:pPr>
+      <w:r>
+        <w:rPr>
+          <w:sz w:val="20"/>
+          <w:szCs w:val="20"/>
+        </w:rPr>
+        <w:t xml:space="preserve">b) Bumper/demoer= ahead of ball + demos/bumps. </w:t>
       </w:r>
     </w:p>
     <w:p>
@@ -1444,23 +1060,7 @@
           <w:sz w:val="20"/>
           <w:szCs w:val="20"/>
         </w:rPr>
-        <w:t xml:space="preserve">f) </w:t>
-      </w:r>
-      <w:proofErr w:type="spellStart"/>
-      <w:r>
-        <w:rPr>
-          <w:sz w:val="20"/>
-          <w:szCs w:val="20"/>
-        </w:rPr>
-        <w:t>ballchaser</w:t>
-      </w:r>
-      <w:proofErr w:type="spellEnd"/>
-      <w:r>
-        <w:rPr>
-          <w:sz w:val="20"/>
-          <w:szCs w:val="20"/>
-        </w:rPr>
-        <w:t xml:space="preserve">= closeness to ball. </w:t>
+        <w:t xml:space="preserve">f) ballchaser= closeness to ball. </w:t>
       </w:r>
     </w:p>
     <w:p>
@@ -1492,48 +1092,23 @@
           <w:sz w:val="20"/>
           <w:szCs w:val="20"/>
         </w:rPr>
-        <w:t xml:space="preserve">h) low boost player (probably same as </w:t>
-      </w:r>
-      <w:proofErr w:type="spellStart"/>
-      <w:r>
-        <w:rPr>
-          <w:sz w:val="20"/>
-          <w:szCs w:val="20"/>
-        </w:rPr>
-        <w:t>ballchaser</w:t>
-      </w:r>
-      <w:proofErr w:type="spellEnd"/>
-      <w:r>
-        <w:rPr>
-          <w:sz w:val="20"/>
-          <w:szCs w:val="20"/>
-        </w:rPr>
-        <w:t xml:space="preserve">)= boost . </w:t>
-      </w:r>
-    </w:p>
-    <w:p>
-      <w:pPr>
-        <w:pStyle w:val="ListParagraph"/>
-        <w:rPr>
-          <w:sz w:val="20"/>
-          <w:szCs w:val="20"/>
-        </w:rPr>
-      </w:pPr>
-      <w:proofErr w:type="spellStart"/>
-      <w:r>
-        <w:rPr>
-          <w:sz w:val="20"/>
-          <w:szCs w:val="20"/>
-        </w:rPr>
-        <w:t>i</w:t>
-      </w:r>
-      <w:proofErr w:type="spellEnd"/>
-      <w:r>
-        <w:rPr>
-          <w:sz w:val="20"/>
-          <w:szCs w:val="20"/>
-        </w:rPr>
-        <w:t>) high boost player (probably same as big rotations)= boost</w:t>
+        <w:t xml:space="preserve">h) low boost player (probably same as ballchaser)= boost . </w:t>
+      </w:r>
+    </w:p>
+    <w:p>
+      <w:pPr>
+        <w:pStyle w:val="ListParagraph"/>
+        <w:rPr>
+          <w:sz w:val="20"/>
+          <w:szCs w:val="20"/>
+        </w:rPr>
+      </w:pPr>
+      <w:r>
+        <w:rPr>
+          <w:sz w:val="20"/>
+          <w:szCs w:val="20"/>
+        </w:rPr>
+        <w:t>i) high boost player (probably same as big rotations)= boost</w:t>
       </w:r>
     </w:p>
     <w:p>
@@ -1605,71 +1180,7 @@
           <w:sz w:val="20"/>
           <w:szCs w:val="20"/>
         </w:rPr>
-        <w:t xml:space="preserve">c) not back to defend, very </w:t>
-      </w:r>
-      <w:proofErr w:type="spellStart"/>
-      <w:r>
-        <w:rPr>
-          <w:sz w:val="20"/>
-          <w:szCs w:val="20"/>
-        </w:rPr>
-        <w:t>postivie</w:t>
-      </w:r>
-      <w:proofErr w:type="spellEnd"/>
-      <w:r>
-        <w:rPr>
-          <w:sz w:val="20"/>
-          <w:szCs w:val="20"/>
-        </w:rPr>
-        <w:t xml:space="preserve"> </w:t>
-      </w:r>
-      <w:proofErr w:type="spellStart"/>
-      <w:r>
-        <w:rPr>
-          <w:sz w:val="20"/>
-          <w:szCs w:val="20"/>
-        </w:rPr>
-        <w:t>playstle</w:t>
-      </w:r>
-      <w:proofErr w:type="spellEnd"/>
-      <w:r>
-        <w:rPr>
-          <w:sz w:val="20"/>
-          <w:szCs w:val="20"/>
-        </w:rPr>
-        <w:t xml:space="preserve">, </w:t>
-      </w:r>
-      <w:proofErr w:type="spellStart"/>
-      <w:r>
-        <w:rPr>
-          <w:sz w:val="20"/>
-          <w:szCs w:val="20"/>
-        </w:rPr>
-        <w:t>e.g</w:t>
-      </w:r>
-      <w:proofErr w:type="spellEnd"/>
-      <w:r>
-        <w:rPr>
-          <w:sz w:val="20"/>
-          <w:szCs w:val="20"/>
-        </w:rPr>
-        <w:t xml:space="preserve"> not worried about </w:t>
-      </w:r>
-      <w:proofErr w:type="spellStart"/>
-      <w:r>
-        <w:rPr>
-          <w:sz w:val="20"/>
-          <w:szCs w:val="20"/>
-        </w:rPr>
-        <w:t>defense</w:t>
-      </w:r>
-      <w:proofErr w:type="spellEnd"/>
-      <w:r>
-        <w:rPr>
-          <w:sz w:val="20"/>
-          <w:szCs w:val="20"/>
-        </w:rPr>
-        <w:t xml:space="preserve"> </w:t>
+        <w:t xml:space="preserve">c) not back to defend, very postivie playstle, e.g not worried about defense </w:t>
       </w:r>
     </w:p>
     <w:p>
@@ -1701,119 +1212,39 @@
           <w:sz w:val="20"/>
           <w:szCs w:val="20"/>
         </w:rPr>
-        <w:t xml:space="preserve">e) need </w:t>
-      </w:r>
-      <w:proofErr w:type="spellStart"/>
-      <w:r>
-        <w:rPr>
-          <w:sz w:val="20"/>
-          <w:szCs w:val="20"/>
-        </w:rPr>
-        <w:t>teamates</w:t>
-      </w:r>
-      <w:proofErr w:type="spellEnd"/>
-      <w:r>
-        <w:rPr>
-          <w:sz w:val="20"/>
-          <w:szCs w:val="20"/>
-        </w:rPr>
-        <w:t xml:space="preserve"> on some wavelength, often always looks for it even when not on. all or nothing play, 2 </w:t>
-      </w:r>
-      <w:proofErr w:type="gramStart"/>
-      <w:r>
-        <w:rPr>
-          <w:sz w:val="20"/>
-          <w:szCs w:val="20"/>
-        </w:rPr>
-        <w:t>commit</w:t>
-      </w:r>
-      <w:proofErr w:type="gramEnd"/>
-      <w:r>
-        <w:rPr>
-          <w:sz w:val="20"/>
-          <w:szCs w:val="20"/>
-        </w:rPr>
-        <w:t xml:space="preserve"> for 1 defender. won't shoot </w:t>
-      </w:r>
-    </w:p>
-    <w:p>
-      <w:pPr>
-        <w:pStyle w:val="ListParagraph"/>
-        <w:rPr>
-          <w:sz w:val="20"/>
-          <w:szCs w:val="20"/>
-        </w:rPr>
-      </w:pPr>
-      <w:r>
-        <w:rPr>
-          <w:sz w:val="20"/>
-          <w:szCs w:val="20"/>
-        </w:rPr>
-        <w:t xml:space="preserve">f/h) lack of speed, one bad </w:t>
-      </w:r>
-      <w:proofErr w:type="spellStart"/>
-      <w:r>
-        <w:rPr>
-          <w:sz w:val="20"/>
-          <w:szCs w:val="20"/>
-        </w:rPr>
-        <w:t>chall</w:t>
-      </w:r>
-      <w:proofErr w:type="spellEnd"/>
-      <w:r>
-        <w:rPr>
-          <w:sz w:val="20"/>
-          <w:szCs w:val="20"/>
-        </w:rPr>
-        <w:t xml:space="preserve">=out of play. cutting </w:t>
-      </w:r>
-      <w:proofErr w:type="spellStart"/>
-      <w:r>
-        <w:rPr>
-          <w:sz w:val="20"/>
-          <w:szCs w:val="20"/>
-        </w:rPr>
-        <w:t>teamate</w:t>
-      </w:r>
-      <w:proofErr w:type="spellEnd"/>
-      <w:r>
-        <w:rPr>
-          <w:sz w:val="20"/>
-          <w:szCs w:val="20"/>
-        </w:rPr>
-        <w:t xml:space="preserve"> even when they have better angle, </w:t>
-      </w:r>
-    </w:p>
-    <w:p>
-      <w:pPr>
-        <w:pStyle w:val="ListParagraph"/>
-        <w:rPr>
-          <w:sz w:val="20"/>
-          <w:szCs w:val="20"/>
-        </w:rPr>
-      </w:pPr>
-      <w:r>
-        <w:rPr>
-          <w:sz w:val="20"/>
-          <w:szCs w:val="20"/>
-        </w:rPr>
-        <w:t>g/</w:t>
-      </w:r>
-      <w:proofErr w:type="spellStart"/>
-      <w:r>
-        <w:rPr>
-          <w:sz w:val="20"/>
-          <w:szCs w:val="20"/>
-        </w:rPr>
-        <w:t>i</w:t>
-      </w:r>
-      <w:proofErr w:type="spellEnd"/>
-      <w:r>
-        <w:rPr>
-          <w:sz w:val="20"/>
-          <w:szCs w:val="20"/>
-        </w:rPr>
-        <w:t>) don't force enough, bad at pressuring ball, always gives space,</w:t>
+        <w:t xml:space="preserve">e) need teamates on some wavelength, often always looks for it even when not on. all or nothing play, 2 commit for 1 defender. won't shoot </w:t>
+      </w:r>
+    </w:p>
+    <w:p>
+      <w:pPr>
+        <w:pStyle w:val="ListParagraph"/>
+        <w:rPr>
+          <w:sz w:val="20"/>
+          <w:szCs w:val="20"/>
+        </w:rPr>
+      </w:pPr>
+      <w:r>
+        <w:rPr>
+          <w:sz w:val="20"/>
+          <w:szCs w:val="20"/>
+        </w:rPr>
+        <w:t xml:space="preserve">f/h) lack of speed, one bad chall=out of play. cutting teamate even when they have better angle, </w:t>
+      </w:r>
+    </w:p>
+    <w:p>
+      <w:pPr>
+        <w:pStyle w:val="ListParagraph"/>
+        <w:rPr>
+          <w:sz w:val="20"/>
+          <w:szCs w:val="20"/>
+        </w:rPr>
+      </w:pPr>
+      <w:r>
+        <w:rPr>
+          <w:sz w:val="20"/>
+          <w:szCs w:val="20"/>
+        </w:rPr>
+        <w:t>g/i) don't force enough, bad at pressuring ball, always gives space,</w:t>
       </w:r>
     </w:p>
     <w:p>
@@ -1833,23 +1264,7 @@
           <w:sz w:val="20"/>
           <w:szCs w:val="20"/>
         </w:rPr>
-        <w:t xml:space="preserve">average speed, </w:t>
-      </w:r>
-      <w:proofErr w:type="spellStart"/>
-      <w:r>
-        <w:rPr>
-          <w:sz w:val="20"/>
-          <w:szCs w:val="20"/>
-        </w:rPr>
-        <w:t>avg</w:t>
-      </w:r>
-      <w:proofErr w:type="spellEnd"/>
-      <w:r>
-        <w:rPr>
-          <w:sz w:val="20"/>
-          <w:szCs w:val="20"/>
-        </w:rPr>
-        <w:t xml:space="preserve"> boost</w:t>
+        <w:t>average speed, avg boost</w:t>
       </w:r>
     </w:p>
     <w:p>
@@ -1869,55 +1284,7 @@
           <w:sz w:val="20"/>
           <w:szCs w:val="20"/>
         </w:rPr>
-        <w:t xml:space="preserve">hit ball hard. think about </w:t>
-      </w:r>
-      <w:proofErr w:type="spellStart"/>
-      <w:r>
-        <w:rPr>
-          <w:sz w:val="20"/>
-          <w:szCs w:val="20"/>
-        </w:rPr>
-        <w:t>teamates</w:t>
-      </w:r>
-      <w:proofErr w:type="spellEnd"/>
-      <w:r>
-        <w:rPr>
-          <w:sz w:val="20"/>
-          <w:szCs w:val="20"/>
-        </w:rPr>
-        <w:t xml:space="preserve"> boost, positioning, etc. watch opponents not ball= all ranks below </w:t>
-      </w:r>
-      <w:proofErr w:type="spellStart"/>
-      <w:r>
-        <w:rPr>
-          <w:sz w:val="20"/>
-          <w:szCs w:val="20"/>
-        </w:rPr>
-        <w:t>ssl</w:t>
-      </w:r>
-      <w:proofErr w:type="spellEnd"/>
-      <w:r>
-        <w:rPr>
-          <w:sz w:val="20"/>
-          <w:szCs w:val="20"/>
-        </w:rPr>
-        <w:t xml:space="preserve">. </w:t>
-      </w:r>
-      <w:proofErr w:type="spellStart"/>
-      <w:r>
-        <w:rPr>
-          <w:sz w:val="20"/>
-          <w:szCs w:val="20"/>
-        </w:rPr>
-        <w:t>ssl</w:t>
-      </w:r>
-      <w:proofErr w:type="spellEnd"/>
-      <w:r>
-        <w:rPr>
-          <w:sz w:val="20"/>
-          <w:szCs w:val="20"/>
-        </w:rPr>
-        <w:t>= as before+ everything else in the game</w:t>
+        <w:t>hit ball hard. think about teamates boost, positioning, etc. watch opponents not ball= all ranks below ssl. ssl= as before+ everything else in the game</w:t>
       </w:r>
     </w:p>
     <w:p>
@@ -1937,39 +1304,7 @@
           <w:sz w:val="20"/>
           <w:szCs w:val="20"/>
         </w:rPr>
-        <w:t xml:space="preserve">could be= % behind ball, would have to verify this though, look at </w:t>
-      </w:r>
-      <w:proofErr w:type="spellStart"/>
-      <w:r>
-        <w:rPr>
-          <w:sz w:val="20"/>
-          <w:szCs w:val="20"/>
-        </w:rPr>
-        <w:t>johhnyboi</w:t>
-      </w:r>
-      <w:proofErr w:type="spellEnd"/>
-      <w:r>
-        <w:rPr>
-          <w:sz w:val="20"/>
-          <w:szCs w:val="20"/>
-        </w:rPr>
-        <w:t xml:space="preserve"> vid for more info. idk would have to separate out things to see more, </w:t>
-      </w:r>
-      <w:proofErr w:type="spellStart"/>
-      <w:r>
-        <w:rPr>
-          <w:sz w:val="20"/>
-          <w:szCs w:val="20"/>
-        </w:rPr>
-        <w:t>e.g</w:t>
-      </w:r>
-      <w:proofErr w:type="spellEnd"/>
-      <w:r>
-        <w:rPr>
-          <w:sz w:val="20"/>
-          <w:szCs w:val="20"/>
-        </w:rPr>
-        <w:t xml:space="preserve"> recovery speed, (like time from 0 to max speed)</w:t>
+        <w:t>could be= % behind ball, would have to verify this though, look at johhnyboi vid for more info. idk would have to separate out things to see more, e.g recovery speed, (like time from 0 to max speed)</w:t>
       </w:r>
     </w:p>
     <w:p>
@@ -1989,55 +1324,7 @@
           <w:sz w:val="20"/>
           <w:szCs w:val="20"/>
         </w:rPr>
-        <w:t xml:space="preserve">behind ball </w:t>
-      </w:r>
-      <w:proofErr w:type="spellStart"/>
-      <w:r>
-        <w:rPr>
-          <w:sz w:val="20"/>
-          <w:szCs w:val="20"/>
-        </w:rPr>
-        <w:t>i</w:t>
-      </w:r>
-      <w:proofErr w:type="spellEnd"/>
-      <w:r>
-        <w:rPr>
-          <w:sz w:val="20"/>
-          <w:szCs w:val="20"/>
-        </w:rPr>
-        <w:t xml:space="preserve"> think is because it means you're not out of play, always good defence and then if behind ball when attacking= in control of ball. </w:t>
-      </w:r>
-      <w:proofErr w:type="gramStart"/>
-      <w:r>
-        <w:rPr>
-          <w:sz w:val="20"/>
-          <w:szCs w:val="20"/>
-        </w:rPr>
-        <w:t>also</w:t>
-      </w:r>
-      <w:proofErr w:type="gramEnd"/>
-      <w:r>
-        <w:rPr>
-          <w:sz w:val="20"/>
-          <w:szCs w:val="20"/>
-        </w:rPr>
-        <w:t xml:space="preserve"> could show where </w:t>
-      </w:r>
-      <w:proofErr w:type="spellStart"/>
-      <w:r>
-        <w:rPr>
-          <w:sz w:val="20"/>
-          <w:szCs w:val="20"/>
-        </w:rPr>
-        <w:t>avg</w:t>
-      </w:r>
-      <w:proofErr w:type="spellEnd"/>
-      <w:r>
-        <w:rPr>
-          <w:sz w:val="20"/>
-          <w:szCs w:val="20"/>
-        </w:rPr>
-        <w:t xml:space="preserve"> ball position is, if in someone else's half probably likely they're on defence most of game=lose</w:t>
+        <w:t>behind ball i think is because it means you're not out of play, always good defence and then if behind ball when attacking= in control of ball. also could show where avg ball position is, if in someone else's half probably likely they're on defence most of game=lose</w:t>
       </w:r>
     </w:p>
     <w:p>
@@ -2136,23 +1423,7 @@
           <w:sz w:val="20"/>
           <w:szCs w:val="20"/>
         </w:rPr>
-        <w:t xml:space="preserve">A lot of the playstyle suggestions are useful, especially a-f, they line up with general ones I thought of as well as previous answers to this question, since many of these terms and labels are used frequently when describing a specific player. The characteristics related to each </w:t>
-      </w:r>
-      <w:proofErr w:type="gramStart"/>
-      <w:r>
-        <w:rPr>
-          <w:sz w:val="20"/>
-          <w:szCs w:val="20"/>
-        </w:rPr>
-        <w:t>ones</w:t>
-      </w:r>
-      <w:proofErr w:type="gramEnd"/>
-      <w:r>
-        <w:rPr>
-          <w:sz w:val="20"/>
-          <w:szCs w:val="20"/>
-        </w:rPr>
-        <w:t xml:space="preserve"> I generally agree with and will likely be included somewhat when creating the model that gives the user a playstyle. </w:t>
+        <w:t xml:space="preserve">A lot of the playstyle suggestions are useful, especially a-f, they line up with general ones I thought of as well as previous answers to this question, since many of these terms and labels are used frequently when describing a specific player. The characteristics related to each ones I generally agree with and will likely be included somewhat when creating the model that gives the user a playstyle. </w:t>
       </w:r>
     </w:p>
     <w:p>
@@ -2183,23 +1454,7 @@
           <w:szCs w:val="20"/>
         </w:rPr>
         <w:lastRenderedPageBreak/>
-        <w:t xml:space="preserve">Also, the multiple pieces of advice included in q5 for each playstyle show that when giving general advice for one, I can also back it up with evidence, so specific advice can be highlighted more if there are specific statistics that can be shown to prove it. </w:t>
-      </w:r>
-      <w:proofErr w:type="spellStart"/>
-      <w:r>
-        <w:rPr>
-          <w:sz w:val="20"/>
-          <w:szCs w:val="20"/>
-        </w:rPr>
-        <w:t>i.e</w:t>
-      </w:r>
-      <w:proofErr w:type="spellEnd"/>
-      <w:r>
-        <w:rPr>
-          <w:sz w:val="20"/>
-          <w:szCs w:val="20"/>
-        </w:rPr>
-        <w:t>: a player may be a bumper (enforcer), so if labelled so, and their time spent near their goal is much lower than average for their rank before a goal occurs, the site could give the advice that they aren’t back to defend enough and provide that statistic in comparison to the average one.</w:t>
+        <w:t>Also, the multiple pieces of advice included in q5 for each playstyle show that when giving general advice for one, I can also back it up with evidence, so specific advice can be highlighted more if there are specific statistics that can be shown to prove it. i.e: a player may be a bumper (enforcer), so if labelled so, and their time spent near their goal is much lower than average for their rank before a goal occurs, the site could give the advice that they aren’t back to defend enough and provide that statistic in comparison to the average one.</w:t>
       </w:r>
     </w:p>
     <w:p>
@@ -2276,53 +1531,12 @@
           <w:szCs w:val="20"/>
         </w:rPr>
       </w:pPr>
-      <w:proofErr w:type="gramStart"/>
-      <w:r>
-        <w:rPr>
-          <w:sz w:val="20"/>
-          <w:szCs w:val="20"/>
-        </w:rPr>
-        <w:t>Yes</w:t>
-      </w:r>
-      <w:proofErr w:type="gramEnd"/>
-      <w:r>
-        <w:rPr>
-          <w:sz w:val="20"/>
-          <w:szCs w:val="20"/>
-        </w:rPr>
-        <w:t xml:space="preserve"> </w:t>
-      </w:r>
-      <w:proofErr w:type="spellStart"/>
-      <w:r>
-        <w:rPr>
-          <w:sz w:val="20"/>
-          <w:szCs w:val="20"/>
-        </w:rPr>
-        <w:t>ive</w:t>
-      </w:r>
-      <w:proofErr w:type="spellEnd"/>
-      <w:r>
-        <w:rPr>
-          <w:sz w:val="20"/>
-          <w:szCs w:val="20"/>
-        </w:rPr>
-        <w:t xml:space="preserve"> used it to improve my rotation through heat maps e.g. not staying one place at once or rotating into goal and mostly to look at more </w:t>
-      </w:r>
-      <w:proofErr w:type="spellStart"/>
-      <w:r>
-        <w:rPr>
-          <w:sz w:val="20"/>
-          <w:szCs w:val="20"/>
-        </w:rPr>
-        <w:t>indepth</w:t>
-      </w:r>
-      <w:proofErr w:type="spellEnd"/>
-      <w:r>
-        <w:rPr>
-          <w:sz w:val="20"/>
-          <w:szCs w:val="20"/>
-        </w:rPr>
-        <w:t xml:space="preserve"> stats of the games</w:t>
+      <w:r>
+        <w:rPr>
+          <w:sz w:val="20"/>
+          <w:szCs w:val="20"/>
+        </w:rPr>
+        <w:t>Yes ive used it to improve my rotation through heat maps e.g. not staying one place at once or rotating into goal and mostly to look at more indepth stats of the games</w:t>
       </w:r>
     </w:p>
     <w:p>
@@ -2362,17 +1576,8 @@
           <w:sz w:val="20"/>
           <w:szCs w:val="20"/>
         </w:rPr>
-        <w:t xml:space="preserve">chasey, controlled, fast, grounded, </w:t>
-      </w:r>
-      <w:proofErr w:type="spellStart"/>
-      <w:r>
-        <w:rPr>
-          <w:sz w:val="20"/>
-          <w:szCs w:val="20"/>
-        </w:rPr>
-        <w:t>aerialed</w:t>
-      </w:r>
-      <w:proofErr w:type="spellEnd"/>
+        <w:t>chasey, controlled, fast, grounded, aerialed</w:t>
+      </w:r>
     </w:p>
     <w:p>
       <w:pPr>
@@ -2471,23 +1676,7 @@
           <w:sz w:val="20"/>
           <w:szCs w:val="20"/>
         </w:rPr>
-        <w:t xml:space="preserve">probably percentage positioned in certain areas and percentage of time </w:t>
-      </w:r>
-      <w:proofErr w:type="spellStart"/>
-      <w:r>
-        <w:rPr>
-          <w:sz w:val="20"/>
-          <w:szCs w:val="20"/>
-        </w:rPr>
-        <w:t>infront</w:t>
-      </w:r>
-      <w:proofErr w:type="spellEnd"/>
-      <w:r>
-        <w:rPr>
-          <w:sz w:val="20"/>
-          <w:szCs w:val="20"/>
-        </w:rPr>
-        <w:t>/behind the ball</w:t>
+        <w:t>probably percentage positioned in certain areas and percentage of time infront/behind the ball</w:t>
       </w:r>
     </w:p>
     <w:p>
@@ -6403,15 +5592,7 @@
     </w:p>
     <w:p>
       <w:r>
-        <w:t xml:space="preserve">After the first request (34908 </w:t>
-      </w:r>
-      <w:proofErr w:type="spellStart"/>
-      <w:r>
-        <w:t>ms</w:t>
-      </w:r>
-      <w:proofErr w:type="spellEnd"/>
-      <w:r>
-        <w:t xml:space="preserve">), each request afterward happened sequentially, with around 7000ms between them on average (7 seconds). </w:t>
+        <w:t xml:space="preserve">After the first request (34908 ms), each request afterward happened sequentially, with around 7000ms between them on average (7 seconds). </w:t>
       </w:r>
     </w:p>
     <w:p>
@@ -6536,15 +5717,7 @@
     </w:p>
     <w:p>
       <w:r>
-        <w:t xml:space="preserve">Data Overview (with </w:t>
-      </w:r>
-      <w:proofErr w:type="spellStart"/>
-      <w:r>
-        <w:t>KrysJP</w:t>
-      </w:r>
-      <w:proofErr w:type="spellEnd"/>
-      <w:r>
-        <w:t xml:space="preserve"> as target player)</w:t>
+        <w:t>Data Overview (with KrysJP as target player)</w:t>
       </w:r>
     </w:p>
     <w:p>
@@ -7380,6 +6553,7 @@
         <w:rPr>
           <w:b/>
           <w:bCs/>
+          <w:noProof/>
         </w:rPr>
         <w:drawing>
           <wp:inline distT="0" distB="0" distL="0" distR="0" wp14:anchorId="65C807F1" wp14:editId="05049282">
@@ -7416,6 +6590,117 @@
             </a:graphic>
           </wp:inline>
         </w:drawing>
+      </w:r>
+    </w:p>
+    <w:p>
+      <w:pPr>
+        <w:rPr>
+          <w:b/>
+          <w:bCs/>
+        </w:rPr>
+      </w:pPr>
+      <w:r>
+        <w:rPr>
+          <w:b/>
+          <w:bCs/>
+        </w:rPr>
+        <w:t>Appendix F.16 – Model Evaluations (2v2/3v3)</w:t>
+      </w:r>
+    </w:p>
+    <w:p>
+      <w:pPr>
+        <w:rPr>
+          <w:b/>
+          <w:bCs/>
+        </w:rPr>
+      </w:pPr>
+      <w:r>
+        <w:rPr>
+          <w:b/>
+          <w:bCs/>
+        </w:rPr>
+        <w:drawing>
+          <wp:inline distT="0" distB="0" distL="0" distR="0" wp14:anchorId="664D97F9" wp14:editId="49CC1F85">
+            <wp:extent cx="2648320" cy="1991003"/>
+            <wp:effectExtent l="0" t="0" r="0" b="9525"/>
+            <wp:docPr id="46029826" name="Picture 1"/>
+            <wp:cNvGraphicFramePr>
+              <a:graphicFrameLocks xmlns:a="http://schemas.openxmlformats.org/drawingml/2006/main" noChangeAspect="1"/>
+            </wp:cNvGraphicFramePr>
+            <a:graphic xmlns:a="http://schemas.openxmlformats.org/drawingml/2006/main">
+              <a:graphicData uri="http://schemas.openxmlformats.org/drawingml/2006/picture">
+                <pic:pic xmlns:pic="http://schemas.openxmlformats.org/drawingml/2006/picture">
+                  <pic:nvPicPr>
+                    <pic:cNvPr id="46029826" name=""/>
+                    <pic:cNvPicPr/>
+                  </pic:nvPicPr>
+                  <pic:blipFill>
+                    <a:blip r:embed="rId58"/>
+                    <a:stretch>
+                      <a:fillRect/>
+                    </a:stretch>
+                  </pic:blipFill>
+                  <pic:spPr>
+                    <a:xfrm>
+                      <a:off x="0" y="0"/>
+                      <a:ext cx="2648320" cy="1991003"/>
+                    </a:xfrm>
+                    <a:prstGeom prst="rect">
+                      <a:avLst/>
+                    </a:prstGeom>
+                  </pic:spPr>
+                </pic:pic>
+              </a:graphicData>
+            </a:graphic>
+          </wp:inline>
+        </w:drawing>
+      </w:r>
+      <w:r>
+        <w:rPr>
+          <w:b/>
+          <w:bCs/>
+        </w:rPr>
+        <w:drawing>
+          <wp:inline distT="0" distB="0" distL="0" distR="0" wp14:anchorId="0C9B679B" wp14:editId="40E261C7">
+            <wp:extent cx="2762636" cy="2000529"/>
+            <wp:effectExtent l="0" t="0" r="0" b="0"/>
+            <wp:docPr id="80311209" name="Picture 1"/>
+            <wp:cNvGraphicFramePr>
+              <a:graphicFrameLocks xmlns:a="http://schemas.openxmlformats.org/drawingml/2006/main" noChangeAspect="1"/>
+            </wp:cNvGraphicFramePr>
+            <a:graphic xmlns:a="http://schemas.openxmlformats.org/drawingml/2006/main">
+              <a:graphicData uri="http://schemas.openxmlformats.org/drawingml/2006/picture">
+                <pic:pic xmlns:pic="http://schemas.openxmlformats.org/drawingml/2006/picture">
+                  <pic:nvPicPr>
+                    <pic:cNvPr id="80311209" name=""/>
+                    <pic:cNvPicPr/>
+                  </pic:nvPicPr>
+                  <pic:blipFill>
+                    <a:blip r:embed="rId59"/>
+                    <a:stretch>
+                      <a:fillRect/>
+                    </a:stretch>
+                  </pic:blipFill>
+                  <pic:spPr>
+                    <a:xfrm>
+                      <a:off x="0" y="0"/>
+                      <a:ext cx="2762636" cy="2000529"/>
+                    </a:xfrm>
+                    <a:prstGeom prst="rect">
+                      <a:avLst/>
+                    </a:prstGeom>
+                  </pic:spPr>
+                </pic:pic>
+              </a:graphicData>
+            </a:graphic>
+          </wp:inline>
+        </w:drawing>
+      </w:r>
+      <w:r>
+        <w:rPr>
+          <w:noProof/>
+        </w:rPr>
+        <w:t xml:space="preserve"> </w:t>
       </w:r>
     </w:p>
     <w:sectPr>

</xml_diff>